<commit_message>
Manuscript in the journal's official elsarticle template (D56)
elsarticle.cls generated from the supplied dtx, front matter per
elsarticle-template-num, tables fitted to the text block, Latin Modern
fonts, CAS stand-in removed. make_figures.py embeds TrueType fonts.

Co-Authored-By: Claude Opus 5.5 <noreply@anthropic.com>
Claude-Session: https://claude.ai/code/session_01GmqQpV3GfnfDawN9ZdytqY
</commit_message>
<xml_diff>
--- a/paper/submission/manuscript.docx
+++ b/paper/submission/manuscript.docx
@@ -3549,7 +3549,7 @@
               <w:jc w:val="right"/>
             </w:pPr>
             <w:r>
-              <w:t xml:space="preserve">Four-class labels</w:t>
+              <w:t xml:space="preserve">Four-class</w:t>
             </w:r>
           </w:p>
         </w:tc>
@@ -3561,7 +3561,7 @@
               <w:jc w:val="right"/>
             </w:pPr>
             <w:r>
-              <w:t xml:space="preserve">After deduplication</w:t>
+              <w:t xml:space="preserve">Deduplicated</w:t>
             </w:r>
           </w:p>
         </w:tc>
@@ -4138,7 +4138,53 @@
         <w:jc w:val="left"/>
       </w:pPr>
       <w:r>
-        <w:t xml:space="preserve">Table 2. Balanced accuracy on the clean test set, mean over five seeds with 95% confidence interval.</w:t>
+        <w:t xml:space="preserve">Table 2. Balanced accuracy on the clean test set, mean over five seeds with 95% confidence interval. Image and patient name the privacy unit of central training, and Dir. 0.5 is the Dirichlet partition with</w:t>
+      </w:r>
+      <w:r>
+        <w:t xml:space="preserve"> </w:t>
+      </w:r>
+      <m:oMath>
+        <m:r>
+          <m:t>α</m:t>
+        </m:r>
+        <m:r>
+          <m:rPr>
+            <m:sty m:val="p"/>
+          </m:rPr>
+          <m:t>=</m:t>
+        </m:r>
+        <m:r>
+          <m:t>0.5</m:t>
+        </m:r>
+      </m:oMath>
+      <w:r>
+        <w:t xml:space="preserve"> </w:t>
+      </w:r>
+      <w:r>
+        <w:t xml:space="preserve">and</w:t>
+      </w:r>
+      <w:r>
+        <w:t xml:space="preserve"> </w:t>
+      </w:r>
+      <m:oMath>
+        <m:r>
+          <m:t>K</m:t>
+        </m:r>
+        <m:r>
+          <m:rPr>
+            <m:sty m:val="p"/>
+          </m:rPr>
+          <m:t>=</m:t>
+        </m:r>
+        <m:r>
+          <m:t>10</m:t>
+        </m:r>
+      </m:oMath>
+      <w:r>
+        <w:t xml:space="preserve"> </w:t>
+      </w:r>
+      <w:r>
+        <w:t xml:space="preserve">clients.</w:t>
       </w:r>
     </w:p>
     <w:tbl>
@@ -4147,7 +4193,7 @@
         <w:tblW w:type="auto" w:w="0"/>
         <w:tblLook w:firstRow="1" w:lastRow="0" w:firstColumn="0" w:lastColumn="0" w:noHBand="0" w:noVBand="0" w:val="0020"/>
         <w:jc w:val="start"/>
-        <w:tblCaption w:val="Table 2. Balanced accuracy on the clean test set, mean over five seeds with 95% confidence interval."/>
+        <w:tblCaption w:val="Table 2. Balanced accuracy on the clean test set, mean over five seeds with 95% confidence interval. Image and patient name the privacy unit of central training, and Dir. 0.5 is the Dirichlet partition with \alpha=0.5 and K=10 clients."/>
       </w:tblPr>
       <w:tblGrid>
         <w:gridCol w:w="1320"/>
@@ -4276,7 +4322,7 @@
               <w:jc w:val="left"/>
             </w:pPr>
             <w:r>
-              <w:t xml:space="preserve">Central, record-level</w:t>
+              <w:t xml:space="preserve">Central, image</w:t>
             </w:r>
           </w:p>
         </w:tc>
@@ -4420,7 +4466,7 @@
               <w:jc w:val="left"/>
             </w:pPr>
             <w:r>
-              <w:t xml:space="preserve">Central, patient-level</w:t>
+              <w:t xml:space="preserve">Central, patient</w:t>
             </w:r>
           </w:p>
         </w:tc>
@@ -4700,35 +4746,7 @@
               <w:jc w:val="left"/>
             </w:pPr>
             <w:r>
-              <w:t xml:space="preserve">FedAvg, Dirichlet</w:t>
-            </w:r>
-            <w:r>
-              <w:t xml:space="preserve"> </w:t>
-            </w:r>
-            <m:oMath>
-              <m:r>
-                <m:t>α</m:t>
-              </m:r>
-            </m:oMath>
-            <w:r>
-              <w:t xml:space="preserve"> </w:t>
-            </w:r>
-            <w:r>
-              <w:t xml:space="preserve">0.5,</w:t>
-            </w:r>
-            <w:r>
-              <w:t xml:space="preserve"> </w:t>
-            </w:r>
-            <m:oMath>
-              <m:r>
-                <m:t>K</m:t>
-              </m:r>
-            </m:oMath>
-            <w:r>
-              <w:t xml:space="preserve"> </w:t>
-            </w:r>
-            <w:r>
-              <w:t xml:space="preserve">10</w:t>
+              <w:t xml:space="preserve">FedAvg, Dir. 0.5</w:t>
             </w:r>
           </w:p>
         </w:tc>
@@ -5699,7 +5717,7 @@
               <w:jc w:val="left"/>
             </w:pPr>
             <w:r>
-              <w:t xml:space="preserve">Balanced accuracy</w:t>
+              <w:t xml:space="preserve">Bal. acc.</w:t>
             </w:r>
           </w:p>
         </w:tc>
@@ -5723,7 +5741,7 @@
               <w:jc w:val="left"/>
             </w:pPr>
             <w:r>
-              <w:t xml:space="preserve">TPR at 1% FPR</w:t>
+              <w:t xml:space="preserve">TPR, 1% FPR</w:t>
             </w:r>
           </w:p>
         </w:tc>
@@ -5735,7 +5753,7 @@
               <w:jc w:val="left"/>
             </w:pPr>
             <w:r>
-              <w:t xml:space="preserve">TPR at 0.1% FPR</w:t>
+              <w:t xml:space="preserve">TPR, 0.1% FPR</w:t>
             </w:r>
           </w:p>
         </w:tc>

</xml_diff>

<commit_message>
Figure 6 from Kaggle in the package; figure labels fixed (superscript glyphs, s for weight noise)
Kaggle notebook 19 (v0.9.3-figures) produced fig6 and week07_xai_mediation;
STIX lacks the Unicode superscripts, so axis labels now use mathtext.
Notebook 20 regenerates the figures at v0.9.4-figures.

Co-Authored-By: Claude Opus 5.5 <noreply@anthropic.com>
Claude-Session: https://claude.ai/code/session_01GmqQpV3GfnfDawN9ZdytqY
</commit_message>
<xml_diff>
--- a/paper/submission/manuscript.docx
+++ b/paper/submission/manuscript.docx
@@ -9526,7 +9526,7 @@
     </w:p>
     <w:bookmarkEnd w:id="39"/>
     <w:bookmarkEnd w:id="40"/>
-    <w:bookmarkStart w:id="60" w:name="results"/>
+    <w:bookmarkStart w:id="63" w:name="results"/>
     <w:p>
       <w:pPr>
         <w:pStyle w:val="Heading1"/>
@@ -12810,7 +12810,7 @@
       </w:r>
     </w:p>
     <w:bookmarkEnd w:id="54"/>
-    <w:bookmarkStart w:id="58" w:name="explanations"/>
+    <w:bookmarkStart w:id="61" w:name="explanations"/>
     <w:p>
       <w:pPr>
         <w:pStyle w:val="Heading2"/>
@@ -13186,16 +13186,54 @@
         <w:t xml:space="preserve">Supplementary Table S19). Fig. 6 illustrates the pattern on one image per tumour class.</w:t>
       </w:r>
     </w:p>
-    <w:tbl>
-      <w:tblPr>
-        <w:tblStyle w:val="FigureTable"/>
-        <w:tblW w:type="auto" w:w="0"/>
-        <w:tblLook w:firstRow="0" w:lastRow="0" w:firstColumn="0" w:lastColumn="0"/>
-        <w:jc w:val="center"/>
-      </w:tblPr>
-      <w:tblGrid/>
-      <w:tr/>
-    </w:tbl>
+    <w:p>
+      <w:pPr>
+        <w:pStyle w:val="CaptionedFigure"/>
+        <w:jc w:val="left"/>
+      </w:pPr>
+      <w:r>
+        <w:drawing>
+          <wp:inline>
+            <wp:extent cx="5334000" cy="2857500"/>
+            <wp:effectExtent b="0" l="0" r="0" t="0"/>
+            <wp:docPr descr="" title="" id="59" name="Picture"/>
+            <a:graphic>
+              <a:graphicData uri="http://schemas.openxmlformats.org/drawingml/2006/picture">
+                <pic:pic>
+                  <pic:nvPicPr>
+                    <pic:cNvPr descr="Figure6.png" id="60" name="Picture"/>
+                    <pic:cNvPicPr>
+                      <a:picLocks noChangeArrowheads="1" noChangeAspect="1"/>
+                    </pic:cNvPicPr>
+                  </pic:nvPicPr>
+                  <pic:blipFill>
+                    <a:blip r:embed="rId58"/>
+                    <a:stretch>
+                      <a:fillRect/>
+                    </a:stretch>
+                  </pic:blipFill>
+                  <pic:spPr bwMode="auto">
+                    <a:xfrm>
+                      <a:off x="0" y="0"/>
+                      <a:ext cx="5334000" cy="2857500"/>
+                    </a:xfrm>
+                    <a:prstGeom prst="rect">
+                      <a:avLst/>
+                    </a:prstGeom>
+                    <a:noFill/>
+                    <a:ln w="9525">
+                      <a:noFill/>
+                      <a:headEnd/>
+                      <a:tailEnd/>
+                    </a:ln>
+                  </pic:spPr>
+                </pic:pic>
+              </a:graphicData>
+            </a:graphic>
+          </wp:inline>
+        </w:drawing>
+      </w:r>
+    </w:p>
     <w:p>
       <w:pPr>
         <w:pStyle w:val="ImageCaption"/>
@@ -13265,8 +13303,8 @@
         <w:t xml:space="preserve">to 0.351, which indicates no skull-border artefact (Supplementary Table S18).</w:t>
       </w:r>
     </w:p>
-    <w:bookmarkEnd w:id="58"/>
-    <w:bookmarkStart w:id="59" w:name="source-controls"/>
+    <w:bookmarkEnd w:id="61"/>
+    <w:bookmarkStart w:id="62" w:name="source-controls"/>
     <w:p>
       <w:pPr>
         <w:pStyle w:val="Heading2"/>
@@ -13348,9 +13386,9 @@
         <w:t xml:space="preserve">of what the privacy budget actually buys, which Section 4 addresses.</w:t>
       </w:r>
     </w:p>
-    <w:bookmarkEnd w:id="59"/>
-    <w:bookmarkEnd w:id="60"/>
-    <w:bookmarkStart w:id="67" w:name="discussion"/>
+    <w:bookmarkEnd w:id="62"/>
+    <w:bookmarkEnd w:id="63"/>
+    <w:bookmarkStart w:id="70" w:name="discussion"/>
     <w:p>
       <w:pPr>
         <w:pStyle w:val="Heading1"/>
@@ -13361,7 +13399,7 @@
         <w:t xml:space="preserve">Discussion</w:t>
       </w:r>
     </w:p>
-    <w:bookmarkStart w:id="61" w:name="protection-bought-by-the-privacy-budget"/>
+    <w:bookmarkStart w:id="64" w:name="protection-bought-by-the-privacy-budget"/>
     <w:p>
       <w:pPr>
         <w:pStyle w:val="Heading2"/>
@@ -13526,8 +13564,8 @@
         <w:t xml:space="preserve">11</w:t>
       </w:r>
     </w:p>
-    <w:bookmarkEnd w:id="61"/>
-    <w:bookmarkStart w:id="62" w:name="cost-of-patient-level-protection"/>
+    <w:bookmarkEnd w:id="64"/>
+    <w:bookmarkStart w:id="65" w:name="cost-of-patient-level-protection"/>
     <w:p>
       <w:pPr>
         <w:pStyle w:val="Heading2"/>
@@ -13584,8 +13622,8 @@
         <w:t xml:space="preserve">patients is the most direct route to useful per-patient guarantees.</w:t>
       </w:r>
     </w:p>
-    <w:bookmarkEnd w:id="62"/>
-    <w:bookmarkStart w:id="63" w:name="client-count-and-drift-correction"/>
+    <w:bookmarkEnd w:id="65"/>
+    <w:bookmarkStart w:id="66" w:name="client-count-and-drift-correction"/>
     <w:p>
       <w:pPr>
         <w:pStyle w:val="Heading2"/>
@@ -13709,8 +13747,8 @@
         <w:t xml:space="preserve">or the correction harms the unequal and noisy settings in which it is most needed.</w:t>
       </w:r>
     </w:p>
-    <w:bookmarkEnd w:id="63"/>
-    <w:bookmarkStart w:id="64" w:name="explanations-under-privacy"/>
+    <w:bookmarkEnd w:id="66"/>
+    <w:bookmarkStart w:id="67" w:name="explanations-under-privacy"/>
     <w:p>
       <w:pPr>
         <w:pStyle w:val="Heading2"/>
@@ -13875,8 +13913,8 @@
         <w:t xml:space="preserve">27</w:t>
       </w:r>
     </w:p>
-    <w:bookmarkEnd w:id="64"/>
-    <w:bookmarkStart w:id="65" w:name="benchmark-leakage-and-source-confounding"/>
+    <w:bookmarkEnd w:id="67"/>
+    <w:bookmarkStart w:id="68" w:name="benchmark-leakage-and-source-confounding"/>
     <w:p>
       <w:pPr>
         <w:pStyle w:val="Heading2"/>
@@ -13951,8 +13989,8 @@
         <w:t xml:space="preserve">and flip-invariant deduplication with per-source reporting should become routine.</w:t>
       </w:r>
     </w:p>
-    <w:bookmarkEnd w:id="65"/>
-    <w:bookmarkStart w:id="66" w:name="limitations"/>
+    <w:bookmarkEnd w:id="68"/>
+    <w:bookmarkStart w:id="69" w:name="limitations"/>
     <w:p>
       <w:pPr>
         <w:pStyle w:val="Heading2"/>
@@ -14033,9 +14071,9 @@
         <w:t xml:space="preserve">composed over both candidates is reported but was not used for calibration.</w:t>
       </w:r>
     </w:p>
-    <w:bookmarkEnd w:id="66"/>
-    <w:bookmarkEnd w:id="67"/>
-    <w:bookmarkStart w:id="68" w:name="conclusions"/>
+    <w:bookmarkEnd w:id="69"/>
+    <w:bookmarkEnd w:id="70"/>
+    <w:bookmarkStart w:id="71" w:name="conclusions"/>
     <w:p>
       <w:pPr>
         <w:pStyle w:val="Heading1"/>
@@ -14209,8 +14247,8 @@
         <w:t xml:space="preserve">and the privacy unit, and test their privacy claims with an attack.</w:t>
       </w:r>
     </w:p>
-    <w:bookmarkEnd w:id="68"/>
-    <w:bookmarkStart w:id="69" w:name="authors-contribution"/>
+    <w:bookmarkEnd w:id="71"/>
+    <w:bookmarkStart w:id="72" w:name="authors-contribution"/>
     <w:p>
       <w:pPr>
         <w:pStyle w:val="Heading1"/>
@@ -14269,8 +14307,8 @@
         <w:t xml:space="preserve">Writing – review &amp; editing. [CHECK: roles proposed from the author list, to be confirmed by the authors]</w:t>
       </w:r>
     </w:p>
-    <w:bookmarkEnd w:id="69"/>
-    <w:bookmarkStart w:id="70" w:name="ethic-statement"/>
+    <w:bookmarkEnd w:id="72"/>
+    <w:bookmarkStart w:id="73" w:name="ethic-statement"/>
     <w:p>
       <w:pPr>
         <w:pStyle w:val="Heading1"/>
@@ -14303,8 +14341,8 @@
         <w:t xml:space="preserve">institutional ethics committee]</w:t>
       </w:r>
     </w:p>
-    <w:bookmarkEnd w:id="70"/>
-    <w:bookmarkStart w:id="71" w:name="declaration-of-competing-interest"/>
+    <w:bookmarkEnd w:id="73"/>
+    <w:bookmarkStart w:id="74" w:name="declaration-of-competing-interest"/>
     <w:p>
       <w:pPr>
         <w:pStyle w:val="Heading1"/>
@@ -14331,8 +14369,8 @@
         <w:t xml:space="preserve">appeared to influence the work reported in this paper.</w:t>
       </w:r>
     </w:p>
-    <w:bookmarkEnd w:id="71"/>
-    <w:bookmarkStart w:id="72" w:name="funding"/>
+    <w:bookmarkEnd w:id="74"/>
+    <w:bookmarkStart w:id="75" w:name="funding"/>
     <w:p>
       <w:pPr>
         <w:pStyle w:val="Heading1"/>
@@ -14359,8 +14397,8 @@
         <w:t xml:space="preserve">sectors.</w:t>
       </w:r>
     </w:p>
-    <w:bookmarkEnd w:id="72"/>
-    <w:bookmarkStart w:id="74" w:name="data-availability"/>
+    <w:bookmarkEnd w:id="75"/>
+    <w:bookmarkStart w:id="77" w:name="data-availability"/>
     <w:p>
       <w:pPr>
         <w:pStyle w:val="Heading1"/>
@@ -14425,7 +14463,7 @@
       <w:r>
         <w:t xml:space="preserve"> </w:t>
       </w:r>
-      <w:hyperlink r:id="rId73">
+      <w:hyperlink r:id="rId76">
         <w:r>
           <w:rPr>
             <w:rStyle w:val="Hyperlink"/>
@@ -14446,8 +14484,8 @@
         <w:t xml:space="preserve">public and add the archive DOI before submission]</w:t>
       </w:r>
     </w:p>
-    <w:bookmarkEnd w:id="74"/>
-    <w:bookmarkStart w:id="75" w:name="acknowledgements"/>
+    <w:bookmarkEnd w:id="77"/>
+    <w:bookmarkStart w:id="78" w:name="acknowledgements"/>
     <w:p>
       <w:pPr>
         <w:pStyle w:val="Heading1"/>
@@ -14468,8 +14506,8 @@
         <w:t xml:space="preserve">Training used free GPU time on Kaggle. [CHECK: add any further acknowledgements]</w:t>
       </w:r>
     </w:p>
-    <w:bookmarkEnd w:id="75"/>
-    <w:bookmarkStart w:id="76" w:name="X071796dd6bc546c91e96cca1cf5ff96599de61f"/>
+    <w:bookmarkEnd w:id="78"/>
+    <w:bookmarkStart w:id="79" w:name="X071796dd6bc546c91e96cca1cf5ff96599de61f"/>
     <w:p>
       <w:pPr>
         <w:pStyle w:val="Heading1"/>
@@ -14502,8 +14540,8 @@
         <w:t xml:space="preserve">responsibility for the content of the published article. [CHECK: the authors must confirm the extent of use]</w:t>
       </w:r>
     </w:p>
-    <w:bookmarkEnd w:id="76"/>
-    <w:bookmarkStart w:id="78" w:name="references"/>
+    <w:bookmarkEnd w:id="79"/>
+    <w:bookmarkStart w:id="81" w:name="references"/>
     <w:p>
       <w:pPr>
         <w:pStyle w:val="Heading1"/>
@@ -15257,7 +15295,7 @@
       <w:r>
         <w:t xml:space="preserve"> </w:t>
       </w:r>
-      <w:hyperlink r:id="rId77">
+      <w:hyperlink r:id="rId80">
         <w:r>
           <w:rPr>
             <w:rStyle w:val="Hyperlink"/>
@@ -15526,7 +15564,7 @@
         <w:t xml:space="preserve">. IEEE; 2016:770-778. doi:10.1109/CVPR.2016.90</w:t>
       </w:r>
     </w:p>
-    <w:bookmarkEnd w:id="78"/>
+    <w:bookmarkEnd w:id="81"/>
     <w:sectPr>
       <w:lnNumType w:countBy="1" w:restart="continuous"/>
     </w:sectPr>

</xml_diff>

<commit_message>
Final figures from Kaggle, short captions, graphical abstract environment, re-freeze (D58)
Co-Authored-By: Claude Opus 5.5 <noreply@anthropic.com>
Claude-Session: https://claude.ai/code/session_01GmqQpV3GfnfDawN9ZdytqY
</commit_message>
<xml_diff>
--- a/paper/submission/manuscript.docx
+++ b/paper/submission/manuscript.docx
@@ -2362,19 +2362,7 @@
         <w:jc w:val="left"/>
       </w:pPr>
       <w:r>
-        <w:t xml:space="preserve">Fig. 1. Evaluation framework. (a) Curation of three public collections. (b) Federated training with local DP-SGD at</w:t>
-      </w:r>
-      <w:r>
-        <w:t xml:space="preserve"> </w:t>
-      </w:r>
-      <w:r>
-        <w:t xml:space="preserve">image or patient level and size-weighted FedAvg. (c) Membership inference audit with LiRA. (d) Explanation audit.</w:t>
-      </w:r>
-      <w:r>
-        <w:t xml:space="preserve"> </w:t>
-      </w:r>
-      <w:r>
-        <w:t xml:space="preserve">Alg., algorithm. NCC, normalised cross-correlation. TPR and FPR, true-positive and false-positive rate.</w:t>
+        <w:t xml:space="preserve">Fig. 1. Evaluation framework. (a) Curation. (b) Private federated training. (c) Leakage audit. (d) Explanation audit.</w:t>
       </w:r>
     </w:p>
     <w:bookmarkEnd w:id="29"/>
@@ -8290,7 +8278,7 @@
         <w:jc w:val="left"/>
       </w:pPr>
       <w:r>
-        <w:t xml:space="preserve">Table 1. Images per source through curation and splitting.</w:t>
+        <w:t xml:space="preserve">Table 1. Images per source.</w:t>
       </w:r>
     </w:p>
     <w:tbl>
@@ -8299,7 +8287,7 @@
         <w:tblW w:type="auto" w:w="0"/>
         <w:tblLook w:firstRow="1" w:lastRow="0" w:firstColumn="0" w:lastColumn="0" w:noHBand="0" w:noVBand="0" w:val="0020"/>
         <w:jc w:val="start"/>
-        <w:tblCaption w:val="Table 1. Images per source through curation and splitting."/>
+        <w:tblCaption w:val="Table 1. Images per source."/>
       </w:tblPr>
       <w:tblGrid>
         <w:gridCol w:w="990"/>
@@ -9786,7 +9774,7 @@
         <w:jc w:val="left"/>
       </w:pPr>
       <w:r>
-        <w:t xml:space="preserve">Table 3. Balanced accuracy on the clean test set (747 images), mean over five seeds with 95% confidence interval.</w:t>
+        <w:t xml:space="preserve">Table 3. Clean-set balanced accuracy, mean (95% CI) over five seeds.</w:t>
       </w:r>
     </w:p>
     <w:tbl>
@@ -9795,7 +9783,7 @@
         <w:tblW w:type="auto" w:w="0"/>
         <w:tblLook w:firstRow="1" w:lastRow="0" w:firstColumn="0" w:lastColumn="0" w:noHBand="0" w:noVBand="0" w:val="0020"/>
         <w:jc w:val="start"/>
-        <w:tblCaption w:val="Table 3. Balanced accuracy on the clean test set (747 images), mean over five seeds with 95% confidence interval."/>
+        <w:tblCaption w:val="Table 3. Clean-set balanced accuracy, mean (95% CI) over five seeds."/>
       </w:tblPr>
       <w:tblGrid>
         <w:gridCol w:w="1320"/>
@@ -10533,7 +10521,24 @@
         </m:r>
       </m:oMath>
       <w:r>
-        <w:t xml:space="preserve">). Local-only training on any</w:t>
+        <w:t xml:space="preserve">), and the diamond in</w:t>
+      </w:r>
+      <w:r>
+        <w:t xml:space="preserve"> </w:t>
+      </w:r>
+      <w:r>
+        <w:t xml:space="preserve">Fig. 2 marks the unclipped weight-noise comparator, which has no formal</w:t>
+      </w:r>
+      <w:r>
+        <w:t xml:space="preserve"> </w:t>
+      </w:r>
+      <m:oMath>
+        <m:r>
+          <m:t>ε</m:t>
+        </m:r>
+      </m:oMath>
+      <w:r>
+        <w:t xml:space="preserve">. Local-only training on any</w:t>
       </w:r>
       <w:r>
         <w:t xml:space="preserve"> </w:t>
@@ -10642,7 +10647,7 @@
         <w:jc w:val="left"/>
       </w:pPr>
       <w:r>
-        <w:t xml:space="preserve">Fig. 2. Privacy and utility. Balanced accuracy on 747 clean test images against the privacy budget</w:t>
+        <w:t xml:space="preserve">Fig. 2. Balanced accuracy against privacy budget</w:t>
       </w:r>
       <w:r>
         <w:t xml:space="preserve"> </w:t>
@@ -10688,52 +10693,7 @@
         </m:sSup>
       </m:oMath>
       <w:r>
-        <w:t xml:space="preserve">) for central training at two privacy units and for FedAvg on two partitions. Points are means over</w:t>
-      </w:r>
-      <w:r>
-        <w:t xml:space="preserve"> </w:t>
-      </w:r>
-      <w:r>
-        <w:t xml:space="preserve">five seeds and error bars 95%</w:t>
-      </w:r>
-      <w:r>
-        <w:t xml:space="preserve"> </w:t>
-      </w:r>
-      <m:oMath>
-        <m:r>
-          <m:t>t</m:t>
-        </m:r>
-      </m:oMath>
-      <w:r>
-        <w:t xml:space="preserve">-intervals. The diamond marks unclipped weight noise (</w:t>
-      </w:r>
-      <m:oMath>
-        <m:r>
-          <m:t>s</m:t>
-        </m:r>
-        <m:r>
-          <m:rPr>
-            <m:sty m:val="p"/>
-          </m:rPr>
-          <m:t>=</m:t>
-        </m:r>
-        <m:r>
-          <m:t>0.003</m:t>
-        </m:r>
-      </m:oMath>
-      <w:r>
-        <w:t xml:space="preserve">), which has no formal</w:t>
-      </w:r>
-      <w:r>
-        <w:t xml:space="preserve"> </w:t>
-      </w:r>
-      <m:oMath>
-        <m:r>
-          <m:t>ε</m:t>
-        </m:r>
-      </m:oMath>
-      <w:r>
-        <w:t xml:space="preserve">.</w:t>
+        <w:t xml:space="preserve">). Means of five seeds with 95% CIs.</w:t>
       </w:r>
     </w:p>
     <w:p>
@@ -11175,7 +11135,13 @@
         </m:r>
       </m:oMath>
       <w:r>
-        <w:t xml:space="preserve">) with the rate of 0.003 selected for 10 clients, whereas without DP the slope was</w:t>
+        <w:t xml:space="preserve">) with the rate of 0.003 selected for 10 clients (dashed in Fig. 3),</w:t>
+      </w:r>
+      <w:r>
+        <w:t xml:space="preserve"> </w:t>
+      </w:r>
+      <w:r>
+        <w:t xml:space="preserve">whereas without DP the slope was</w:t>
       </w:r>
       <w:r>
         <w:t xml:space="preserve"> </w:t>
@@ -11269,50 +11235,7 @@
         <w:jc w:val="left"/>
       </w:pPr>
       <w:r>
-        <w:t xml:space="preserve">Fig. 3. Client count under DP. Clean balanced accuracy of FedAvg on Dirichlet (</w:t>
-      </w:r>
-      <m:oMath>
-        <m:r>
-          <m:t>α</m:t>
-        </m:r>
-        <m:r>
-          <m:rPr>
-            <m:sty m:val="p"/>
-          </m:rPr>
-          <m:t>=</m:t>
-        </m:r>
-        <m:r>
-          <m:t>0.5</m:t>
-        </m:r>
-      </m:oMath>
-      <w:r>
-        <w:t xml:space="preserve">) partitions of the same</w:t>
-      </w:r>
-      <w:r>
-        <w:t xml:space="preserve"> </w:t>
-      </w:r>
-      <w:r>
-        <w:t xml:space="preserve">2610 images into</w:t>
-      </w:r>
-      <w:r>
-        <w:t xml:space="preserve"> </w:t>
-      </w:r>
-      <m:oMath>
-        <m:r>
-          <m:t>K</m:t>
-        </m:r>
-        <m:r>
-          <m:rPr>
-            <m:sty m:val="p"/>
-          </m:rPr>
-          <m:t>=</m:t>
-        </m:r>
-        <m:r>
-          <m:t>3</m:t>
-        </m:r>
-      </m:oMath>
-      <w:r>
-        <w:t xml:space="preserve">, 5, 10 and 15 clients, against the aggregated noise standard deviation</w:t>
+        <w:t xml:space="preserve">Fig. 3. Accuracy against aggregated noise</w:t>
       </w:r>
       <w:r>
         <w:t xml:space="preserve"> </w:t>
@@ -11350,30 +11273,30 @@
         <w:t xml:space="preserve"> </w:t>
       </w:r>
       <w:r>
-        <w:t xml:space="preserve">of</w:t>
-      </w:r>
-      <w:r>
-        <w:t xml:space="preserve"> </w:t>
-      </w:r>
-      <w:r>
-        <w:t xml:space="preserve">Eq. (4). Error bars are 95%</w:t>
-      </w:r>
-      <w:r>
-        <w:t xml:space="preserve"> </w:t>
-      </w:r>
-      <m:oMath>
-        <m:r>
-          <m:t>t</m:t>
-        </m:r>
-      </m:oMath>
-      <w:r>
-        <w:t xml:space="preserve">-intervals over five seeds, and the dashed series uses learning rate</w:t>
-      </w:r>
-      <w:r>
-        <w:t xml:space="preserve"> </w:t>
-      </w:r>
-      <w:r>
-        <w:t xml:space="preserve">0.003.</w:t>
+        <w:t xml:space="preserve">for</w:t>
+      </w:r>
+      <w:r>
+        <w:t xml:space="preserve"> </w:t>
+      </w:r>
+      <m:oMath>
+        <m:r>
+          <m:t>K</m:t>
+        </m:r>
+        <m:r>
+          <m:rPr>
+            <m:sty m:val="p"/>
+          </m:rPr>
+          <m:t>=</m:t>
+        </m:r>
+        <m:r>
+          <m:t>3</m:t>
+        </m:r>
+      </m:oMath>
+      <w:r>
+        <w:t xml:space="preserve"> </w:t>
+      </w:r>
+      <w:r>
+        <w:t xml:space="preserve">to 15 clients. Means of five seeds with 95% CIs.</w:t>
       </w:r>
     </w:p>
     <w:p>
@@ -11773,13 +11696,7 @@
         <w:jc w:val="left"/>
       </w:pPr>
       <w:r>
-        <w:t xml:space="preserve">Table 4. Online LiRA against FedAvg on the natural partition, mean over five target models with 95% confidence</w:t>
-      </w:r>
-      <w:r>
-        <w:t xml:space="preserve"> </w:t>
-      </w:r>
-      <w:r>
-        <w:t xml:space="preserve">interval.</w:t>
+        <w:t xml:space="preserve">Table 4. Online LiRA against FedAvg on the natural partition, mean (95% CI) over five targets.</w:t>
       </w:r>
     </w:p>
     <w:tbl>
@@ -11788,7 +11705,7 @@
         <w:tblW w:type="auto" w:w="0"/>
         <w:tblLook w:firstRow="1" w:lastRow="0" w:firstColumn="0" w:lastColumn="0" w:noHBand="0" w:noVBand="0" w:val="0020"/>
         <w:jc w:val="start"/>
-        <w:tblCaption w:val="Table 4. Online LiRA against FedAvg on the natural partition, mean over five target models with 95% confidence interval."/>
+        <w:tblCaption w:val="Table 4. Online LiRA against FedAvg on the natural partition, mean (95% CI) over five targets."/>
       </w:tblPr>
       <w:tblGrid>
         <w:gridCol w:w="1320"/>
@@ -12691,19 +12608,7 @@
         <w:jc w:val="left"/>
       </w:pPr>
       <w:r>
-        <w:t xml:space="preserve">Fig. 4. Membership inference. Online LiRA receiver operating characteristic curves on logarithmic axes against FedAvg</w:t>
-      </w:r>
-      <w:r>
-        <w:t xml:space="preserve"> </w:t>
-      </w:r>
-      <w:r>
-        <w:t xml:space="preserve">on the natural partition, each the mean over five target models with 16 shadow models per configuration. (a) Image</w:t>
-      </w:r>
-      <w:r>
-        <w:t xml:space="preserve"> </w:t>
-      </w:r>
-      <w:r>
-        <w:t xml:space="preserve">level. (b) Figshare patient level. Shaded regions lie below the FPR resolution of the test set.</w:t>
+        <w:t xml:space="preserve">Fig. 4. LiRA ROC curves at image (a) and patient (b) level. Shading marks FPR below the test-set resolution.</w:t>
       </w:r>
     </w:p>
     <w:p>
@@ -13027,13 +12932,7 @@
         <w:jc w:val="left"/>
       </w:pPr>
       <w:r>
-        <w:t xml:space="preserve">Fig. 5. Explanations under privacy. (a) Cross-seed Grad-CAM consistency, the IoU of the top 10% of each model’s map</w:t>
-      </w:r>
-      <w:r>
-        <w:t xml:space="preserve"> </w:t>
-      </w:r>
-      <w:r>
-        <w:t xml:space="preserve">with that of the five-seed mean map, against</w:t>
+        <w:t xml:space="preserve">Fig. 5. Grad-CAM consistency across seeds against</w:t>
       </w:r>
       <w:r>
         <w:t xml:space="preserve"> </w:t>
@@ -13047,24 +12946,7 @@
         <w:t xml:space="preserve"> </w:t>
       </w:r>
       <w:r>
-        <w:t xml:space="preserve">for central models, with 95%</w:t>
-      </w:r>
-      <w:r>
-        <w:t xml:space="preserve"> </w:t>
-      </w:r>
-      <m:oMath>
-        <m:r>
-          <m:t>t</m:t>
-        </m:r>
-      </m:oMath>
-      <w:r>
-        <w:t xml:space="preserve">-intervals. (b) Consistency</w:t>
-      </w:r>
-      <w:r>
-        <w:t xml:space="preserve"> </w:t>
-      </w:r>
-      <w:r>
-        <w:t xml:space="preserve">against clean balanced accuracy for 115 models.</w:t>
+        <w:t xml:space="preserve">(a) and against accuracy (b).</w:t>
       </w:r>
     </w:p>
     <w:p>
@@ -13183,7 +13065,13 @@
         <w:t xml:space="preserve"> </w:t>
       </w:r>
       <w:r>
-        <w:t xml:space="preserve">Supplementary Table S19). Fig. 6 illustrates the pattern on one image per tumour class.</w:t>
+        <w:t xml:space="preserve">Supplementary Table S19). Fig. 6 illustrates the pattern on one image per tumour class, chosen by a rule fixed beforehand as</w:t>
+      </w:r>
+      <w:r>
+        <w:t xml:space="preserve"> </w:t>
+      </w:r>
+      <w:r>
+        <w:t xml:space="preserve">the image with mask area closest to the class median among those the non-private model classifies correctly.</w:t>
       </w:r>
     </w:p>
     <w:p>
@@ -13240,19 +13128,7 @@
         <w:jc w:val="left"/>
       </w:pPr>
       <w:r>
-        <w:t xml:space="preserve">Fig. 6. Grad-CAM examples. One clean Figshare test image per tumour class, chosen by a fixed rule (mask area closest to</w:t>
-      </w:r>
-      <w:r>
-        <w:t xml:space="preserve"> </w:t>
-      </w:r>
-      <w:r>
-        <w:t xml:space="preserve">the class median among images the non-private model classifies correctly), with the expert mask outline in cyan and the</w:t>
-      </w:r>
-      <w:r>
-        <w:t xml:space="preserve"> </w:t>
-      </w:r>
-      <w:r>
-        <w:t xml:space="preserve">Grad-CAM maps of central seed-1 models. Labels give each model’s prediction, in red when wrong.</w:t>
+        <w:t xml:space="preserve">Fig. 6. Grad-CAM maps of central seed-1 models, one test image per class. Cyan, expert mask. Red, wrong prediction.</w:t>
       </w:r>
     </w:p>
     <w:p>
@@ -14475,7 +14351,7 @@
         <w:t xml:space="preserve"> </w:t>
       </w:r>
       <w:r>
-        <w:t xml:space="preserve">under tag v0.9.1-results-frozen. [CHECK: make the repository</w:t>
+        <w:t xml:space="preserve">under tag v0.9.5-results-frozen. [CHECK: make the repository</w:t>
       </w:r>
       <w:r>
         <w:t xml:space="preserve"> </w:t>
@@ -15613,7 +15489,7 @@
         <w:t xml:space="preserve"> </w:t>
       </w:r>
       <w:r>
-        <w:t xml:space="preserve">AUC, area under the receiver operating characteristic curve. DP, differential privacy. DP-SGD, differentially</w:t>
+        <w:t xml:space="preserve">AUC, area under the receiver operating characteristic curve. CI, confidence interval. DP, differential privacy. DP-SGD, differentially</w:t>
       </w:r>
       <w:r>
         <w:t xml:space="preserve"> </w:t>
@@ -15631,7 +15507,7 @@
         <w:t xml:space="preserve"> </w:t>
       </w:r>
       <w:r>
-        <w:t xml:space="preserve">likelihood-ratio attack. NCC, normalised cross-correlation. TPR, true-positive rate.</w:t>
+        <w:t xml:space="preserve">likelihood-ratio attack. NCC, normalised cross-correlation. ROC, receiver operating characteristic. TPR, true-positive rate.</w:t>
       </w:r>
     </w:p>
   </w:footnote>

</xml_diff>

<commit_message>
Resolve author-confirmed items: CRediT roles, ethics waiver, 58.7 GPU hours, acknowledgements
Co-Authored-By: Claude Opus 5.5 <noreply@anthropic.com>
Claude-Session: https://claude.ai/code/session_01GmqQpV3GfnfDawN9ZdytqY
</commit_message>
<xml_diff>
--- a/paper/submission/manuscript.docx
+++ b/paper/submission/manuscript.docx
@@ -9319,13 +9319,7 @@
         <w:t xml:space="preserve"> </w:t>
       </w:r>
       <w:r>
-        <w:t xml:space="preserve">reported runs and the audit took about 59 GPU hours [CHECK: the lab notebook gives 52 hours to the end of Phase 3 and</w:t>
-      </w:r>
-      <w:r>
-        <w:t xml:space="preserve"> </w:t>
-      </w:r>
-      <w:r>
-        <w:t xml:space="preserve">1.7, 4.7 and 0.3 hours for the audit runs, 58.7 hours in all]. Each run is identified by a hash of its resolved</w:t>
+        <w:t xml:space="preserve">reported runs and the audit took 58.7 GPU hours. Each run is identified by a hash of its resolved</w:t>
       </w:r>
       <w:r>
         <w:t xml:space="preserve"> </w:t>
@@ -14180,7 +14174,7 @@
         <w:t xml:space="preserve"> </w:t>
       </w:r>
       <w:r>
-        <w:t xml:space="preserve">Writing – review &amp; editing. [CHECK: roles proposed from the author list, to be confirmed by the authors]</w:t>
+        <w:t xml:space="preserve">Writing – review &amp; editing.</w:t>
       </w:r>
     </w:p>
     <w:bookmarkEnd w:id="72"/>
@@ -14208,13 +14202,7 @@
         <w:t xml:space="preserve"> </w:t>
       </w:r>
       <w:r>
-        <w:t xml:space="preserve">were collected. Ethics approval and informed consent were therefore not required. [CHECK: confirm the waiver with the</w:t>
-      </w:r>
-      <w:r>
-        <w:t xml:space="preserve"> </w:t>
-      </w:r>
-      <w:r>
-        <w:t xml:space="preserve">institutional ethics committee]</w:t>
+        <w:t xml:space="preserve">were collected. Ethics approval and informed consent were therefore not required.</w:t>
       </w:r>
     </w:p>
     <w:bookmarkEnd w:id="73"/>
@@ -14379,7 +14367,7 @@
         <w:jc w:val="left"/>
       </w:pPr>
       <w:r>
-        <w:t xml:space="preserve">Training used free GPU time on Kaggle. [CHECK: add any further acknowledgements]</w:t>
+        <w:t xml:space="preserve">Training used free GPU time on Kaggle.</w:t>
       </w:r>
     </w:p>
     <w:bookmarkEnd w:id="78"/>

</xml_diff>

<commit_message>
Section introductions, Figure 1 and graphical abstract corrections (D61)
Co-Authored-By: Claude Opus 5.5 <noreply@anthropic.com>
Claude-Session: https://claude.ai/code/session_01GmqQpV3GfnfDawN9ZdytqY
</commit_message>
<xml_diff>
--- a/paper/submission/manuscript.docx
+++ b/paper/submission/manuscript.docx
@@ -1493,6 +1493,34 @@
       </w:pPr>
       <w:r>
         <w:t xml:space="preserve">Material and methods</w:t>
+      </w:r>
+    </w:p>
+    <w:p>
+      <w:pPr>
+        <w:pStyle w:val="FirstParagraph"/>
+        <w:spacing w:line="480" w:lineRule="auto"/>
+        <w:jc w:val="left"/>
+      </w:pPr>
+      <w:r>
+        <w:t xml:space="preserve">The methods follow the four stages of the study, namely benchmark curation, private training, the membership audit and</w:t>
+      </w:r>
+      <w:r>
+        <w:t xml:space="preserve"> </w:t>
+      </w:r>
+      <w:r>
+        <w:t xml:space="preserve">the explanation audit. Section 2 first fixes the notation, the threat model and the formal guarantee on</w:t>
+      </w:r>
+      <w:r>
+        <w:t xml:space="preserve"> </w:t>
+      </w:r>
+      <w:r>
+        <w:t xml:space="preserve">which every later component relies. The following subsections describe each stage with its algorithm, and the last two</w:t>
+      </w:r>
+      <w:r>
+        <w:t xml:space="preserve"> </w:t>
+      </w:r>
+      <w:r>
+        <w:t xml:space="preserve">give the experimental settings and the statistical conventions applied throughout.</w:t>
       </w:r>
     </w:p>
     <w:bookmarkStart w:id="25" w:name="problem-formulation-and-threat-model"/>
@@ -2423,7 +2451,7 @@
       <w:r>
         <w:drawing>
           <wp:inline>
-            <wp:extent cx="5334000" cy="1764035"/>
+            <wp:extent cx="5334000" cy="1733880"/>
             <wp:effectExtent b="0" l="0" r="0" t="0"/>
             <wp:docPr descr="" title="" id="27" name="Picture"/>
             <a:graphic>
@@ -2444,7 +2472,7 @@
                   <pic:spPr bwMode="auto">
                     <a:xfrm>
                       <a:off x="0" y="0"/>
-                      <a:ext cx="5334000" cy="1764035"/>
+                      <a:ext cx="5334000" cy="1733880"/>
                     </a:xfrm>
                     <a:prstGeom prst="rect">
                       <a:avLst/>
@@ -9668,13 +9696,7 @@
         </m:r>
       </m:oMath>
       <w:r>
-        <w:t xml:space="preserve">. These methods produced the measurements</w:t>
-      </w:r>
-      <w:r>
-        <w:t xml:space="preserve"> </w:t>
-      </w:r>
-      <w:r>
-        <w:t xml:space="preserve">reported next, starting with the benchmark itself.</w:t>
+        <w:t xml:space="preserve">.</w:t>
       </w:r>
     </w:p>
     <w:bookmarkEnd w:id="39"/>
@@ -9688,6 +9710,34 @@
       </w:pPr>
       <w:r>
         <w:t xml:space="preserve">Results</w:t>
+      </w:r>
+    </w:p>
+    <w:p>
+      <w:pPr>
+        <w:pStyle w:val="FirstParagraph"/>
+        <w:spacing w:line="480" w:lineRule="auto"/>
+        <w:jc w:val="left"/>
+      </w:pPr>
+      <w:r>
+        <w:t xml:space="preserve">The results follow the order of the study goals. The curated benchmark and its contamination check come first,</w:t>
+      </w:r>
+      <w:r>
+        <w:t xml:space="preserve"> </w:t>
+      </w:r>
+      <w:r>
+        <w:t xml:space="preserve">followed by the accuracy cost of each privacy unit, the effect of client count and drift correction, the membership</w:t>
+      </w:r>
+      <w:r>
+        <w:t xml:space="preserve"> </w:t>
+      </w:r>
+      <w:r>
+        <w:t xml:space="preserve">audit, the explanation audit and the source controls. Unless a passage states otherwise, every value refers to the 747</w:t>
+      </w:r>
+      <w:r>
+        <w:t xml:space="preserve"> </w:t>
+      </w:r>
+      <w:r>
+        <w:t xml:space="preserve">clean test images and gives the mean over seeds with its 95% CI.</w:t>
       </w:r>
     </w:p>
     <w:bookmarkStart w:id="41" w:name="curated-benchmark"/>
@@ -15371,13 +15421,7 @@
         <w:t xml:space="preserve"> </w:t>
       </w:r>
       <w:r>
-        <w:t xml:space="preserve">without DP on the full test set, against 0.919 pooled (Supplementary Table S5). These measurements raise the question</w:t>
-      </w:r>
-      <w:r>
-        <w:t xml:space="preserve"> </w:t>
-      </w:r>
-      <w:r>
-        <w:t xml:space="preserve">of what the privacy budget actually buys, which Section 4 addresses.</w:t>
+        <w:t xml:space="preserve">without DP on the full test set, against 0.919 pooled (Supplementary Table S5).</w:t>
       </w:r>
     </w:p>
     <w:bookmarkEnd w:id="62"/>
@@ -15391,6 +15435,34 @@
       </w:pPr>
       <w:r>
         <w:t xml:space="preserve">Discussion</w:t>
+      </w:r>
+    </w:p>
+    <w:p>
+      <w:pPr>
+        <w:pStyle w:val="FirstParagraph"/>
+        <w:spacing w:line="480" w:lineRule="auto"/>
+        <w:jc w:val="left"/>
+      </w:pPr>
+      <w:r>
+        <w:t xml:space="preserve">The discussion first considers what the privacy budget protected and what it cost, at both privacy units and across</w:t>
+      </w:r>
+      <w:r>
+        <w:t xml:space="preserve"> </w:t>
+      </w:r>
+      <w:r>
+        <w:t xml:space="preserve">client counts. It then turns to the change in explanations, to benchmark leakage and source confounding, and finally to</w:t>
+      </w:r>
+      <w:r>
+        <w:t xml:space="preserve"> </w:t>
+      </w:r>
+      <w:r>
+        <w:t xml:space="preserve">the limitations of the evaluation. Each subsection relates the findings to prior work and separates measured effects</w:t>
+      </w:r>
+      <w:r>
+        <w:t xml:space="preserve"> </w:t>
+      </w:r>
+      <w:r>
+        <w:t xml:space="preserve">from interpretations that the experiments did not test directly.</w:t>
       </w:r>
     </w:p>
     <w:bookmarkStart w:id="64" w:name="protection-bought-by-the-privacy-budget"/>

</xml_diff>

<commit_message>
Cite the three Intelligent Oncology papers from the cover letter (D62)
Co-Authored-By: Claude Opus 5.5 <noreply@anthropic.com>
Claude-Session: https://claude.ai/code/session_01GmqQpV3GfnfDawN9ZdytqY
</commit_message>
<xml_diff>
--- a/paper/submission/manuscript.docx
+++ b/paper/submission/manuscript.docx
@@ -511,13 +511,25 @@
         <w:t xml:space="preserve"> </w:t>
       </w:r>
       <w:r>
-        <w:t xml:space="preserve">and its clinical value depends on training data drawn from many hospitals.</w:t>
+        <w:t xml:space="preserve">and deep learning now segments even small brain metastases.</w:t>
       </w:r>
       <w:r>
         <w:rPr>
           <w:vertAlign w:val="superscript"/>
         </w:rPr>
-        <w:t xml:space="preserve">1</w:t>
+        <w:t xml:space="preserve">1,2</w:t>
+      </w:r>
+      <w:r>
+        <w:t xml:space="preserve"> </w:t>
+      </w:r>
+      <w:r>
+        <w:t xml:space="preserve">The clinical value of such models</w:t>
+      </w:r>
+      <w:r>
+        <w:t xml:space="preserve"> </w:t>
+      </w:r>
+      <w:r>
+        <w:t xml:space="preserve">depends on training data drawn from many hospitals.</w:t>
       </w:r>
       <w:r>
         <w:rPr>
@@ -547,7 +559,7 @@
         <w:rPr>
           <w:vertAlign w:val="superscript"/>
         </w:rPr>
-        <w:t xml:space="preserve">2-4</w:t>
+        <w:t xml:space="preserve">3-5</w:t>
       </w:r>
     </w:p>
     <w:p>
@@ -557,43 +569,61 @@
         <w:jc w:val="left"/>
       </w:pPr>
       <w:r>
-        <w:t xml:space="preserve">Sharing model updates is not the same as protecting patients, because updates and released models can reveal</w:t>
-      </w:r>
-      <w:r>
-        <w:t xml:space="preserve"> </w:t>
-      </w:r>
-      <w:r>
-        <w:t xml:space="preserve">whether a person contributed data.</w:t>
+        <w:t xml:space="preserve">Transparency and privacy preservation are both named as conditions for the clinical use of medical artificial</w:t>
+      </w:r>
+      <w:r>
+        <w:t xml:space="preserve"> </w:t>
+      </w:r>
+      <w:r>
+        <w:t xml:space="preserve">intelligence.</w:t>
       </w:r>
       <w:r>
         <w:rPr>
           <w:vertAlign w:val="superscript"/>
         </w:rPr>
-        <w:t xml:space="preserve">5,6</w:t>
-      </w:r>
-      <w:r>
-        <w:t xml:space="preserve"> </w:t>
-      </w:r>
-      <w:r>
-        <w:t xml:space="preserve">Differential privacy (DP) bounds that risk formally,</w:t>
-      </w:r>
-      <w:r>
-        <w:t xml:space="preserve"> </w:t>
-      </w:r>
-      <w:r>
-        <w:t xml:space="preserve">and its practical form for deep networks, differentially private stochastic gradient descent (DP-SGD), clips each</w:t>
-      </w:r>
-      <w:r>
-        <w:t xml:space="preserve"> </w:t>
-      </w:r>
-      <w:r>
-        <w:t xml:space="preserve">example’s gradient and adds calibrated Gaussian noise.</w:t>
+        <w:t xml:space="preserve">6</w:t>
+      </w:r>
+      <w:r>
+        <w:t xml:space="preserve"> </w:t>
+      </w:r>
+      <w:r>
+        <w:t xml:space="preserve">Sharing model updates is not the same as protecting patients, because updates and released</w:t>
+      </w:r>
+      <w:r>
+        <w:t xml:space="preserve"> </w:t>
+      </w:r>
+      <w:r>
+        <w:t xml:space="preserve">models can reveal whether a person contributed data.</w:t>
       </w:r>
       <w:r>
         <w:rPr>
           <w:vertAlign w:val="superscript"/>
         </w:rPr>
-        <w:t xml:space="preserve">7</w:t>
+        <w:t xml:space="preserve">7,8</w:t>
+      </w:r>
+      <w:r>
+        <w:t xml:space="preserve"> </w:t>
+      </w:r>
+      <w:r>
+        <w:t xml:space="preserve">Differential privacy (DP) bounds that risk formally,</w:t>
+      </w:r>
+      <w:r>
+        <w:t xml:space="preserve"> </w:t>
+      </w:r>
+      <w:r>
+        <w:t xml:space="preserve">and its practical form for deep networks, differentially private stochastic gradient descent (DP-SGD), clips each</w:t>
+      </w:r>
+      <w:r>
+        <w:t xml:space="preserve"> </w:t>
+      </w:r>
+      <w:r>
+        <w:t xml:space="preserve">example’s gradient and adds calibrated Gaussian noise.</w:t>
+      </w:r>
+      <w:r>
+        <w:rPr>
+          <w:vertAlign w:val="superscript"/>
+        </w:rPr>
+        <w:t xml:space="preserve">9</w:t>
       </w:r>
       <w:r>
         <w:t xml:space="preserve"> </w:t>
@@ -634,6 +664,320 @@
       </w:r>
       <w:r>
         <w:t xml:space="preserve">training.</w:t>
+      </w:r>
+      <w:r>
+        <w:rPr>
+          <w:vertAlign w:val="superscript"/>
+        </w:rPr>
+        <w:t xml:space="preserve">10</w:t>
+      </w:r>
+      <w:r>
+        <w:t xml:space="preserve"> </w:t>
+      </w:r>
+      <w:r>
+        <w:t xml:space="preserve">The privacy mechanism, its budget and the protected unit are also often not reported in a</w:t>
+      </w:r>
+      <w:r>
+        <w:t xml:space="preserve"> </w:t>
+      </w:r>
+      <w:r>
+        <w:t xml:space="preserve">form that can be checked.</w:t>
+      </w:r>
+      <w:r>
+        <w:rPr>
+          <w:vertAlign w:val="superscript"/>
+        </w:rPr>
+        <w:t xml:space="preserve">11-13</w:t>
+      </w:r>
+      <w:r>
+        <w:t xml:space="preserve"> </w:t>
+      </w:r>
+      <w:r>
+        <w:t xml:space="preserve">[CHECK: the statement for lakshmi2026 and</w:t>
+      </w:r>
+      <w:r>
+        <w:t xml:space="preserve"> </w:t>
+      </w:r>
+      <w:r>
+        <w:t xml:space="preserve">qazi2026 rests on their abstracts, confirm against the full texts]</w:t>
+      </w:r>
+    </w:p>
+    <w:p>
+      <w:pPr>
+        <w:pStyle w:val="BodyText"/>
+        <w:spacing w:line="480" w:lineRule="auto"/>
+        <w:jc w:val="left"/>
+      </w:pPr>
+      <w:r>
+        <w:t xml:space="preserve">The present paper therefore measures, on a deduplicated benchmark with expert tumour masks, what record-level and</w:t>
+      </w:r>
+      <w:r>
+        <w:t xml:space="preserve"> </w:t>
+      </w:r>
+      <w:r>
+        <w:t xml:space="preserve">patient-level DP cost in accuracy, whether measured leakage follows the formal guarantee, and how explanations</w:t>
+      </w:r>
+      <w:r>
+        <w:t xml:space="preserve"> </w:t>
+      </w:r>
+      <w:r>
+        <w:t xml:space="preserve">change under privacy. The study uses only public data, simulated federated clients and post-hoc audits, and it</w:t>
+      </w:r>
+      <w:r>
+        <w:t xml:space="preserve"> </w:t>
+      </w:r>
+      <w:r>
+        <w:t xml:space="preserve">reports every result on a test set cleaned of mirrored duplicates.</w:t>
+      </w:r>
+    </w:p>
+    <w:bookmarkStart w:id="22" w:name="related-work"/>
+    <w:p>
+      <w:pPr>
+        <w:pStyle w:val="Heading2"/>
+        <w:spacing w:line="480" w:lineRule="auto"/>
+        <w:jc w:val="left"/>
+      </w:pPr>
+      <w:r>
+        <w:t xml:space="preserve">Related work</w:t>
+      </w:r>
+    </w:p>
+    <w:p>
+      <w:pPr>
+        <w:pStyle w:val="FirstParagraph"/>
+        <w:spacing w:line="480" w:lineRule="auto"/>
+        <w:jc w:val="left"/>
+      </w:pPr>
+      <w:r>
+        <w:t xml:space="preserve">Federated learning for brain tumours began with multi-institutional segmentation, where models trained without</w:t>
+      </w:r>
+      <w:r>
+        <w:t xml:space="preserve"> </w:t>
+      </w:r>
+      <w:r>
+        <w:t xml:space="preserve">sharing data matched those trained on pooled data.</w:t>
+      </w:r>
+      <w:r>
+        <w:rPr>
+          <w:vertAlign w:val="superscript"/>
+        </w:rPr>
+        <w:t xml:space="preserve">3-5</w:t>
+      </w:r>
+      <w:r>
+        <w:t xml:space="preserve"> </w:t>
+      </w:r>
+      <w:r>
+        <w:t xml:space="preserve">Later classification</w:t>
+      </w:r>
+      <w:r>
+        <w:t xml:space="preserve"> </w:t>
+      </w:r>
+      <w:r>
+        <w:t xml:space="preserve">studies on the merged Figshare, SARTAJ and Br35H collections report accuracies from 94% to 99.29% with federated</w:t>
+      </w:r>
+      <w:r>
+        <w:t xml:space="preserve"> </w:t>
+      </w:r>
+      <w:r>
+        <w:t xml:space="preserve">averaging (FedAvg),</w:t>
+      </w:r>
+      <w:r>
+        <w:rPr>
+          <w:vertAlign w:val="superscript"/>
+        </w:rPr>
+        <w:t xml:space="preserve">14</w:t>
+      </w:r>
+      <w:r>
+        <w:t xml:space="preserve"> </w:t>
+      </w:r>
+      <w:r>
+        <w:t xml:space="preserve">FedProx, SCAFFOLD or transfer learning, and some add Grad-CAM pictures.</w:t>
+      </w:r>
+      <w:r>
+        <w:rPr>
+          <w:vertAlign w:val="superscript"/>
+        </w:rPr>
+        <w:t xml:space="preserve">15-18</w:t>
+      </w:r>
+      <w:r>
+        <w:t xml:space="preserve"> </w:t>
+      </w:r>
+      <w:r>
+        <w:t xml:space="preserve">The present work differs by training on a deduplicated, patient-disjoint benchmark and by attaching an accounted</w:t>
+      </w:r>
+      <w:r>
+        <w:t xml:space="preserve"> </w:t>
+      </w:r>
+      <w:r>
+        <w:t xml:space="preserve">privacy guarantee to every private model.</w:t>
+      </w:r>
+    </w:p>
+    <w:p>
+      <w:pPr>
+        <w:pStyle w:val="BodyText"/>
+        <w:spacing w:line="480" w:lineRule="auto"/>
+        <w:jc w:val="left"/>
+      </w:pPr>
+      <w:r>
+        <w:t xml:space="preserve">Differential privacy has been applied to medical imaging with dedicated DP-SGD libraries and accounting</w:t>
+      </w:r>
+      <w:r>
+        <w:t xml:space="preserve"> </w:t>
+      </w:r>
+      <w:r>
+        <w:t xml:space="preserve">tools.</w:t>
+      </w:r>
+      <w:r>
+        <w:rPr>
+          <w:vertAlign w:val="superscript"/>
+        </w:rPr>
+        <w:t xml:space="preserve">19-21</w:t>
+      </w:r>
+      <w:r>
+        <w:t xml:space="preserve"> </w:t>
+      </w:r>
+      <w:r>
+        <w:t xml:space="preserve">Kaissis et al. trained a three-site federated chest radiograph</w:t>
+      </w:r>
+      <w:r>
+        <w:t xml:space="preserve"> </w:t>
+      </w:r>
+      <w:r>
+        <w:t xml:space="preserve">model at</w:t>
+      </w:r>
+      <w:r>
+        <w:t xml:space="preserve"> </w:t>
+      </w:r>
+      <m:oMath>
+        <m:r>
+          <m:t>ε</m:t>
+        </m:r>
+        <m:r>
+          <m:rPr>
+            <m:sty m:val="p"/>
+          </m:rPr>
+          <m:t>=</m:t>
+        </m:r>
+        <m:r>
+          <m:t>6</m:t>
+        </m:r>
+      </m:oMath>
+      <w:r>
+        <w:t xml:space="preserve"> </w:t>
+      </w:r>
+      <w:r>
+        <w:t xml:space="preserve">whose accuracy stayed comparable to that of two radiologists.</w:t>
+      </w:r>
+      <w:r>
+        <w:rPr>
+          <w:vertAlign w:val="superscript"/>
+        </w:rPr>
+        <w:t xml:space="preserve">22</w:t>
+      </w:r>
+      <w:r>
+        <w:t xml:space="preserve"> </w:t>
+      </w:r>
+      <w:r>
+        <w:t xml:space="preserve">Adnan et</w:t>
+      </w:r>
+      <w:r>
+        <w:t xml:space="preserve"> </w:t>
+      </w:r>
+      <w:r>
+        <w:t xml:space="preserve">al. studied differentially private federated learning on histopathology with varying numbers of</w:t>
+      </w:r>
+      <w:r>
+        <w:t xml:space="preserve"> </w:t>
+      </w:r>
+      <w:r>
+        <w:t xml:space="preserve">providers,</w:t>
+      </w:r>
+      <w:r>
+        <w:rPr>
+          <w:vertAlign w:val="superscript"/>
+        </w:rPr>
+        <w:t xml:space="preserve">23</w:t>
+      </w:r>
+      <w:r>
+        <w:t xml:space="preserve"> </w:t>
+      </w:r>
+      <w:r>
+        <w:t xml:space="preserve">and Tayebi Arasteh et al. found that private training lowered accuracy mainly for</w:t>
+      </w:r>
+      <w:r>
+        <w:t xml:space="preserve"> </w:t>
+      </w:r>
+      <w:r>
+        <w:t xml:space="preserve">difficult diagnoses.</w:t>
+      </w:r>
+      <w:r>
+        <w:rPr>
+          <w:vertAlign w:val="superscript"/>
+        </w:rPr>
+        <w:t xml:space="preserve">24</w:t>
+      </w:r>
+      <w:r>
+        <w:t xml:space="preserve"> </w:t>
+      </w:r>
+      <w:r>
+        <w:t xml:space="preserve">Ziller et al. showed that large budgets can already block reconstruction</w:t>
+      </w:r>
+      <w:r>
+        <w:t xml:space="preserve"> </w:t>
+      </w:r>
+      <w:r>
+        <w:t xml:space="preserve">attacks.</w:t>
+      </w:r>
+      <w:r>
+        <w:rPr>
+          <w:vertAlign w:val="superscript"/>
+        </w:rPr>
+        <w:t xml:space="preserve">25</w:t>
+      </w:r>
+      <w:r>
+        <w:t xml:space="preserve"> </w:t>
+      </w:r>
+      <w:r>
+        <w:t xml:space="preserve">These studies protect single records, whereas the present work compares record-level and</w:t>
+      </w:r>
+      <w:r>
+        <w:t xml:space="preserve"> </w:t>
+      </w:r>
+      <w:r>
+        <w:t xml:space="preserve">patient-level guarantees on the same data and audits both empirically.</w:t>
+      </w:r>
+    </w:p>
+    <w:p>
+      <w:pPr>
+        <w:pStyle w:val="BodyText"/>
+        <w:spacing w:line="480" w:lineRule="auto"/>
+        <w:jc w:val="left"/>
+      </w:pPr>
+      <w:r>
+        <w:t xml:space="preserve">Membership inference measures privacy empirically, and the likelihood-ratio attack (LiRA) compares a target model’s</w:t>
+      </w:r>
+      <w:r>
+        <w:t xml:space="preserve"> </w:t>
+      </w:r>
+      <w:r>
+        <w:t xml:space="preserve">confidence on an example with that of shadow models trained with and without it.</w:t>
+      </w:r>
+      <w:r>
+        <w:rPr>
+          <w:vertAlign w:val="superscript"/>
+        </w:rPr>
+        <w:t xml:space="preserve">26</w:t>
+      </w:r>
+      <w:r>
+        <w:t xml:space="preserve"> </w:t>
+      </w:r>
+      <w:r>
+        <w:t xml:space="preserve">Knolle et al. reported that patients with several similar records can face</w:t>
+      </w:r>
+      <w:r>
+        <w:t xml:space="preserve"> </w:t>
+      </w:r>
+      <w:r>
+        <w:t xml:space="preserve">near-perfect attack success even when aggregate success looks random.</w:t>
       </w:r>
       <w:r>
         <w:rPr>
@@ -645,31 +989,45 @@
         <w:t xml:space="preserve"> </w:t>
       </w:r>
       <w:r>
-        <w:t xml:space="preserve">The privacy mechanism, its budget and the protected unit are also often not reported in a</w:t>
-      </w:r>
-      <w:r>
-        <w:t xml:space="preserve"> </w:t>
-      </w:r>
-      <w:r>
-        <w:t xml:space="preserve">form that can be checked.</w:t>
+        <w:t xml:space="preserve">The closest federated brain</w:t>
+      </w:r>
+      <w:r>
+        <w:t xml:space="preserve"> </w:t>
+      </w:r>
+      <w:r>
+        <w:t xml:space="preserve">tumour study adds Gaussian noise with standard deviation 0.5 to client weights without clipping, so its stated</w:t>
+      </w:r>
+      <w:r>
+        <w:t xml:space="preserve"> </w:t>
+      </w:r>
+      <m:oMath>
+        <m:r>
+          <m:t>ε</m:t>
+        </m:r>
+      </m:oMath>
+      <w:r>
+        <w:t xml:space="preserve"> </w:t>
+      </w:r>
+      <w:r>
+        <w:t xml:space="preserve">of about 3.4 cannot be derived from the mechanism.</w:t>
       </w:r>
       <w:r>
         <w:rPr>
           <w:vertAlign w:val="superscript"/>
         </w:rPr>
-        <w:t xml:space="preserve">9-11</w:t>
-      </w:r>
-      <w:r>
-        <w:t xml:space="preserve"> </w:t>
-      </w:r>
-      <w:r>
-        <w:t xml:space="preserve">[CHECK: the statement for lakshmi2026 and</w:t>
-      </w:r>
-      <w:r>
-        <w:t xml:space="preserve"> </w:t>
-      </w:r>
-      <w:r>
-        <w:t xml:space="preserve">qazi2026 rests on their abstracts, confirm against the full texts]</w:t>
+        <w:t xml:space="preserve">13</w:t>
+      </w:r>
+      <w:r>
+        <w:t xml:space="preserve"> </w:t>
+      </w:r>
+      <w:r>
+        <w:t xml:space="preserve">The present work runs LiRA at the</w:t>
+      </w:r>
+      <w:r>
+        <w:t xml:space="preserve"> </w:t>
+      </w:r>
+      <w:r>
+        <w:t xml:space="preserve">image and the patient level against formally private models and against that unclipped mechanism.</w:t>
       </w:r>
     </w:p>
     <w:p>
@@ -679,423 +1037,95 @@
         <w:jc w:val="left"/>
       </w:pPr>
       <w:r>
-        <w:t xml:space="preserve">The present paper therefore measures, on a deduplicated benchmark with expert tumour masks, what record-level and</w:t>
-      </w:r>
-      <w:r>
-        <w:t xml:space="preserve"> </w:t>
-      </w:r>
-      <w:r>
-        <w:t xml:space="preserve">patient-level DP cost in accuracy, whether measured leakage follows the formal guarantee, and how explanations</w:t>
-      </w:r>
-      <w:r>
-        <w:t xml:space="preserve"> </w:t>
-      </w:r>
-      <w:r>
-        <w:t xml:space="preserve">change under privacy. The study uses only public data, simulated federated clients and post-hoc audits, and it</w:t>
-      </w:r>
-      <w:r>
-        <w:t xml:space="preserve"> </w:t>
-      </w:r>
-      <w:r>
-        <w:t xml:space="preserve">reports every result on a test set cleaned of mirrored duplicates.</w:t>
-      </w:r>
-    </w:p>
-    <w:bookmarkStart w:id="22" w:name="related-work"/>
-    <w:p>
-      <w:pPr>
-        <w:pStyle w:val="Heading2"/>
-        <w:spacing w:line="480" w:lineRule="auto"/>
-        <w:jc w:val="left"/>
-      </w:pPr>
-      <w:r>
-        <w:t xml:space="preserve">Related work</w:t>
-      </w:r>
-    </w:p>
-    <w:p>
-      <w:pPr>
-        <w:pStyle w:val="FirstParagraph"/>
-        <w:spacing w:line="480" w:lineRule="auto"/>
-        <w:jc w:val="left"/>
-      </w:pPr>
-      <w:r>
-        <w:t xml:space="preserve">Federated learning for brain tumours began with multi-institutional segmentation, where models trained without</w:t>
-      </w:r>
-      <w:r>
-        <w:t xml:space="preserve"> </w:t>
-      </w:r>
-      <w:r>
-        <w:t xml:space="preserve">sharing data matched those trained on pooled data.</w:t>
+        <w:t xml:space="preserve">Private training also changes explanations, since Saifullah et al. and Manna and Sett reported that DP alters</w:t>
+      </w:r>
+      <w:r>
+        <w:t xml:space="preserve"> </w:t>
+      </w:r>
+      <w:r>
+        <w:t xml:space="preserve">attributions across many datasets and methods,</w:t>
       </w:r>
       <w:r>
         <w:rPr>
           <w:vertAlign w:val="superscript"/>
         </w:rPr>
-        <w:t xml:space="preserve">2-4</w:t>
-      </w:r>
-      <w:r>
-        <w:t xml:space="preserve"> </w:t>
-      </w:r>
-      <w:r>
-        <w:t xml:space="preserve">Later classification</w:t>
-      </w:r>
-      <w:r>
-        <w:t xml:space="preserve"> </w:t>
-      </w:r>
-      <w:r>
-        <w:t xml:space="preserve">studies on the merged Figshare, SARTAJ and Br35H collections report accuracies from 94% to 99.29% with federated</w:t>
-      </w:r>
-      <w:r>
-        <w:t xml:space="preserve"> </w:t>
-      </w:r>
-      <w:r>
-        <w:t xml:space="preserve">averaging (FedAvg),</w:t>
+        <w:t xml:space="preserve">27,28</w:t>
+      </w:r>
+      <w:r>
+        <w:t xml:space="preserve"> </w:t>
+      </w:r>
+      <w:r>
+        <w:t xml:space="preserve">and Adebayo et al. showed that some saliency methods</w:t>
+      </w:r>
+      <w:r>
+        <w:t xml:space="preserve"> </w:t>
+      </w:r>
+      <w:r>
+        <w:t xml:space="preserve">ignore the learned weights.</w:t>
       </w:r>
       <w:r>
         <w:rPr>
           <w:vertAlign w:val="superscript"/>
         </w:rPr>
-        <w:t xml:space="preserve">12</w:t>
-      </w:r>
-      <w:r>
-        <w:t xml:space="preserve"> </w:t>
-      </w:r>
-      <w:r>
-        <w:t xml:space="preserve">FedProx, SCAFFOLD or transfer learning, and some add Grad-CAM pictures.</w:t>
+        <w:t xml:space="preserve">29</w:t>
+      </w:r>
+      <w:r>
+        <w:t xml:space="preserve"> </w:t>
+      </w:r>
+      <w:r>
+        <w:t xml:space="preserve">The present work measures Grad-CAM localisation against expert tumour</w:t>
+      </w:r>
+      <w:r>
+        <w:t xml:space="preserve"> </w:t>
+      </w:r>
+      <w:r>
+        <w:t xml:space="preserve">masks, its consistency across seeds and a randomisation check, and asks whether privacy affects explanations beyond</w:t>
+      </w:r>
+      <w:r>
+        <w:t xml:space="preserve"> </w:t>
+      </w:r>
+      <w:r>
+        <w:t xml:space="preserve">its effect on accuracy.</w:t>
+      </w:r>
+    </w:p>
+    <w:p>
+      <w:pPr>
+        <w:pStyle w:val="BodyText"/>
+        <w:spacing w:line="480" w:lineRule="auto"/>
+        <w:jc w:val="left"/>
+      </w:pPr>
+      <w:r>
+        <w:t xml:space="preserve">Benchmark contamination is the last theme, and Vangala et al. found that 28.8% of a widely used Kaggle test split</w:t>
+      </w:r>
+      <w:r>
+        <w:t xml:space="preserve"> </w:t>
+      </w:r>
+      <w:r>
+        <w:t xml:space="preserve">has a near-twin in training,</w:t>
       </w:r>
       <w:r>
         <w:rPr>
           <w:vertAlign w:val="superscript"/>
         </w:rPr>
-        <w:t xml:space="preserve">13-16</w:t>
-      </w:r>
-      <w:r>
-        <w:t xml:space="preserve"> </w:t>
-      </w:r>
-      <w:r>
-        <w:t xml:space="preserve">The present work differs by training on a deduplicated, patient-disjoint benchmark and by attaching an accounted</w:t>
-      </w:r>
-      <w:r>
-        <w:t xml:space="preserve"> </w:t>
-      </w:r>
-      <w:r>
-        <w:t xml:space="preserve">privacy guarantee to every private model.</w:t>
-      </w:r>
-    </w:p>
-    <w:p>
-      <w:pPr>
-        <w:pStyle w:val="BodyText"/>
-        <w:spacing w:line="480" w:lineRule="auto"/>
-        <w:jc w:val="left"/>
-      </w:pPr>
-      <w:r>
-        <w:t xml:space="preserve">Differential privacy has been applied to medical imaging with dedicated DP-SGD libraries and accounting</w:t>
-      </w:r>
-      <w:r>
-        <w:t xml:space="preserve"> </w:t>
-      </w:r>
-      <w:r>
-        <w:t xml:space="preserve">tools.</w:t>
+        <w:t xml:space="preserve">10</w:t>
+      </w:r>
+      <w:r>
+        <w:t xml:space="preserve"> </w:t>
+      </w:r>
+      <w:r>
+        <w:t xml:space="preserve">and the source collections differ in class</w:t>
+      </w:r>
+      <w:r>
+        <w:t xml:space="preserve"> </w:t>
+      </w:r>
+      <w:r>
+        <w:t xml:space="preserve">composition.</w:t>
       </w:r>
       <w:r>
         <w:rPr>
           <w:vertAlign w:val="superscript"/>
         </w:rPr>
-        <w:t xml:space="preserve">17-19</w:t>
-      </w:r>
-      <w:r>
-        <w:t xml:space="preserve"> </w:t>
-      </w:r>
-      <w:r>
-        <w:t xml:space="preserve">Kaissis et al. trained a three-site federated chest radiograph</w:t>
-      </w:r>
-      <w:r>
-        <w:t xml:space="preserve"> </w:t>
-      </w:r>
-      <w:r>
-        <w:t xml:space="preserve">model at</w:t>
-      </w:r>
-      <w:r>
-        <w:t xml:space="preserve"> </w:t>
-      </w:r>
-      <m:oMath>
-        <m:r>
-          <m:t>ε</m:t>
-        </m:r>
-        <m:r>
-          <m:rPr>
-            <m:sty m:val="p"/>
-          </m:rPr>
-          <m:t>=</m:t>
-        </m:r>
-        <m:r>
-          <m:t>6</m:t>
-        </m:r>
-      </m:oMath>
-      <w:r>
-        <w:t xml:space="preserve"> </w:t>
-      </w:r>
-      <w:r>
-        <w:t xml:space="preserve">whose accuracy stayed comparable to that of two radiologists.</w:t>
-      </w:r>
-      <w:r>
-        <w:rPr>
-          <w:vertAlign w:val="superscript"/>
-        </w:rPr>
-        <w:t xml:space="preserve">20</w:t>
-      </w:r>
-      <w:r>
-        <w:t xml:space="preserve"> </w:t>
-      </w:r>
-      <w:r>
-        <w:t xml:space="preserve">Adnan et</w:t>
-      </w:r>
-      <w:r>
-        <w:t xml:space="preserve"> </w:t>
-      </w:r>
-      <w:r>
-        <w:t xml:space="preserve">al. studied differentially private federated learning on histopathology with varying numbers of</w:t>
-      </w:r>
-      <w:r>
-        <w:t xml:space="preserve"> </w:t>
-      </w:r>
-      <w:r>
-        <w:t xml:space="preserve">providers,</w:t>
-      </w:r>
-      <w:r>
-        <w:rPr>
-          <w:vertAlign w:val="superscript"/>
-        </w:rPr>
-        <w:t xml:space="preserve">21</w:t>
-      </w:r>
-      <w:r>
-        <w:t xml:space="preserve"> </w:t>
-      </w:r>
-      <w:r>
-        <w:t xml:space="preserve">and Tayebi Arasteh et al. found that private training lowered accuracy mainly for</w:t>
-      </w:r>
-      <w:r>
-        <w:t xml:space="preserve"> </w:t>
-      </w:r>
-      <w:r>
-        <w:t xml:space="preserve">difficult diagnoses.</w:t>
-      </w:r>
-      <w:r>
-        <w:rPr>
-          <w:vertAlign w:val="superscript"/>
-        </w:rPr>
-        <w:t xml:space="preserve">22</w:t>
-      </w:r>
-      <w:r>
-        <w:t xml:space="preserve"> </w:t>
-      </w:r>
-      <w:r>
-        <w:t xml:space="preserve">Ziller et al. showed that large budgets can already block reconstruction</w:t>
-      </w:r>
-      <w:r>
-        <w:t xml:space="preserve"> </w:t>
-      </w:r>
-      <w:r>
-        <w:t xml:space="preserve">attacks.</w:t>
-      </w:r>
-      <w:r>
-        <w:rPr>
-          <w:vertAlign w:val="superscript"/>
-        </w:rPr>
-        <w:t xml:space="preserve">23</w:t>
-      </w:r>
-      <w:r>
-        <w:t xml:space="preserve"> </w:t>
-      </w:r>
-      <w:r>
-        <w:t xml:space="preserve">These studies protect single records, whereas the present work compares record-level and</w:t>
-      </w:r>
-      <w:r>
-        <w:t xml:space="preserve"> </w:t>
-      </w:r>
-      <w:r>
-        <w:t xml:space="preserve">patient-level guarantees on the same data and audits both empirically.</w:t>
-      </w:r>
-    </w:p>
-    <w:p>
-      <w:pPr>
-        <w:pStyle w:val="BodyText"/>
-        <w:spacing w:line="480" w:lineRule="auto"/>
-        <w:jc w:val="left"/>
-      </w:pPr>
-      <w:r>
-        <w:t xml:space="preserve">Membership inference measures privacy empirically, and the likelihood-ratio attack (LiRA) compares a target model’s</w:t>
-      </w:r>
-      <w:r>
-        <w:t xml:space="preserve"> </w:t>
-      </w:r>
-      <w:r>
-        <w:t xml:space="preserve">confidence on an example with that of shadow models trained with and without it.</w:t>
-      </w:r>
-      <w:r>
-        <w:rPr>
-          <w:vertAlign w:val="superscript"/>
-        </w:rPr>
-        <w:t xml:space="preserve">24</w:t>
-      </w:r>
-      <w:r>
-        <w:t xml:space="preserve"> </w:t>
-      </w:r>
-      <w:r>
-        <w:t xml:space="preserve">Knolle et al. reported that patients with several similar records can face</w:t>
-      </w:r>
-      <w:r>
-        <w:t xml:space="preserve"> </w:t>
-      </w:r>
-      <w:r>
-        <w:t xml:space="preserve">near-perfect attack success even when aggregate success looks random.</w:t>
-      </w:r>
-      <w:r>
-        <w:rPr>
-          <w:vertAlign w:val="superscript"/>
-        </w:rPr>
-        <w:t xml:space="preserve">6</w:t>
-      </w:r>
-      <w:r>
-        <w:t xml:space="preserve"> </w:t>
-      </w:r>
-      <w:r>
-        <w:t xml:space="preserve">The closest federated brain</w:t>
-      </w:r>
-      <w:r>
-        <w:t xml:space="preserve"> </w:t>
-      </w:r>
-      <w:r>
-        <w:t xml:space="preserve">tumour study adds Gaussian noise with standard deviation 0.5 to client weights without clipping, so its stated</w:t>
-      </w:r>
-      <w:r>
-        <w:t xml:space="preserve"> </w:t>
-      </w:r>
-      <m:oMath>
-        <m:r>
-          <m:t>ε</m:t>
-        </m:r>
-      </m:oMath>
-      <w:r>
-        <w:t xml:space="preserve"> </w:t>
-      </w:r>
-      <w:r>
-        <w:t xml:space="preserve">of about 3.4 cannot be derived from the mechanism.</w:t>
-      </w:r>
-      <w:r>
-        <w:rPr>
-          <w:vertAlign w:val="superscript"/>
-        </w:rPr>
-        <w:t xml:space="preserve">11</w:t>
-      </w:r>
-      <w:r>
-        <w:t xml:space="preserve"> </w:t>
-      </w:r>
-      <w:r>
-        <w:t xml:space="preserve">The present work runs LiRA at the</w:t>
-      </w:r>
-      <w:r>
-        <w:t xml:space="preserve"> </w:t>
-      </w:r>
-      <w:r>
-        <w:t xml:space="preserve">image and the patient level against formally private models and against that unclipped mechanism.</w:t>
-      </w:r>
-    </w:p>
-    <w:p>
-      <w:pPr>
-        <w:pStyle w:val="BodyText"/>
-        <w:spacing w:line="480" w:lineRule="auto"/>
-        <w:jc w:val="left"/>
-      </w:pPr>
-      <w:r>
-        <w:t xml:space="preserve">Private training also changes explanations, since Saifullah et al. and Manna and Sett reported that DP alters</w:t>
-      </w:r>
-      <w:r>
-        <w:t xml:space="preserve"> </w:t>
-      </w:r>
-      <w:r>
-        <w:t xml:space="preserve">attributions across many datasets and methods,</w:t>
-      </w:r>
-      <w:r>
-        <w:rPr>
-          <w:vertAlign w:val="superscript"/>
-        </w:rPr>
-        <w:t xml:space="preserve">25,26</w:t>
-      </w:r>
-      <w:r>
-        <w:t xml:space="preserve"> </w:t>
-      </w:r>
-      <w:r>
-        <w:t xml:space="preserve">and Adebayo et al. showed that some saliency methods</w:t>
-      </w:r>
-      <w:r>
-        <w:t xml:space="preserve"> </w:t>
-      </w:r>
-      <w:r>
-        <w:t xml:space="preserve">ignore the learned weights.</w:t>
-      </w:r>
-      <w:r>
-        <w:rPr>
-          <w:vertAlign w:val="superscript"/>
-        </w:rPr>
-        <w:t xml:space="preserve">27</w:t>
-      </w:r>
-      <w:r>
-        <w:t xml:space="preserve"> </w:t>
-      </w:r>
-      <w:r>
-        <w:t xml:space="preserve">The present work measures Grad-CAM localisation against expert tumour</w:t>
-      </w:r>
-      <w:r>
-        <w:t xml:space="preserve"> </w:t>
-      </w:r>
-      <w:r>
-        <w:t xml:space="preserve">masks, its consistency across seeds and a randomisation check, and asks whether privacy affects explanations beyond</w:t>
-      </w:r>
-      <w:r>
-        <w:t xml:space="preserve"> </w:t>
-      </w:r>
-      <w:r>
-        <w:t xml:space="preserve">its effect on accuracy.</w:t>
-      </w:r>
-    </w:p>
-    <w:p>
-      <w:pPr>
-        <w:pStyle w:val="BodyText"/>
-        <w:spacing w:line="480" w:lineRule="auto"/>
-        <w:jc w:val="left"/>
-      </w:pPr>
-      <w:r>
-        <w:t xml:space="preserve">Benchmark contamination is the last theme, and Vangala et al. found that 28.8% of a widely used Kaggle test split</w:t>
-      </w:r>
-      <w:r>
-        <w:t xml:space="preserve"> </w:t>
-      </w:r>
-      <w:r>
-        <w:t xml:space="preserve">has a near-twin in training,</w:t>
-      </w:r>
-      <w:r>
-        <w:rPr>
-          <w:vertAlign w:val="superscript"/>
-        </w:rPr>
-        <w:t xml:space="preserve">8</w:t>
-      </w:r>
-      <w:r>
-        <w:t xml:space="preserve"> </w:t>
-      </w:r>
-      <w:r>
-        <w:t xml:space="preserve">and the source collections differ in class</w:t>
-      </w:r>
-      <w:r>
-        <w:t xml:space="preserve"> </w:t>
-      </w:r>
-      <w:r>
-        <w:t xml:space="preserve">composition.</w:t>
-      </w:r>
-      <w:r>
-        <w:rPr>
-          <w:vertAlign w:val="superscript"/>
-        </w:rPr>
-        <w:t xml:space="preserve">28-30</w:t>
+        <w:t xml:space="preserve">30-32</w:t>
       </w:r>
       <w:r>
         <w:t xml:space="preserve"> </w:t>
@@ -2257,99 +2287,111 @@
         <w:t xml:space="preserve"> </w:t>
       </w:r>
       <w:r>
-        <w:t xml:space="preserve">aggregation is used. A unit split across</w:t>
-      </w:r>
-      <w:r>
-        <w:t xml:space="preserve"> </w:t>
-      </w:r>
-      <m:oMath>
-        <m:r>
-          <m:t>m</m:t>
-        </m:r>
-      </m:oMath>
-      <w:r>
-        <w:t xml:space="preserve"> </w:t>
-      </w:r>
-      <w:r>
-        <w:t xml:space="preserve">clients is protected by the composition of</w:t>
-      </w:r>
-      <w:r>
-        <w:t xml:space="preserve"> </w:t>
-      </w:r>
-      <m:oMath>
-        <m:r>
-          <m:t>m</m:t>
-        </m:r>
-      </m:oMath>
-      <w:r>
-        <w:t xml:space="preserve"> </w:t>
-      </w:r>
-      <w:r>
-        <w:t xml:space="preserve">guarantees, and the worst</w:t>
-      </w:r>
-      <w:r>
-        <w:t xml:space="preserve"> </w:t>
-      </w:r>
-      <w:r>
-        <w:t xml:space="preserve">case over units is reported. Client-level DP, which hides the participation of a whole hospital,</w:t>
+        <w:t xml:space="preserve">aggregation or other cryptographic protection</w:t>
       </w:r>
       <w:r>
         <w:rPr>
           <w:vertAlign w:val="superscript"/>
         </w:rPr>
-        <w:t xml:space="preserve">31</w:t>
-      </w:r>
-      <w:r>
-        <w:t xml:space="preserve"> </w:t>
-      </w:r>
-      <w:r>
-        <w:t xml:space="preserve">was</w:t>
-      </w:r>
-      <w:r>
-        <w:t xml:space="preserve"> </w:t>
-      </w:r>
-      <w:r>
-        <w:t xml:space="preserve">not evaluated, because with three to 15 clients the noise needed to mask one client would dominate the aggregate.</w:t>
-      </w:r>
-    </w:p>
-    <w:p>
-      <w:pPr>
-        <w:pStyle w:val="BodyText"/>
-        <w:spacing w:line="480" w:lineRule="auto"/>
-        <w:jc w:val="left"/>
-      </w:pPr>
-      <w:r>
-        <w:t xml:space="preserve">The audit adversary has query access to the logits of the released model, knows the training recipe and the data</w:t>
-      </w:r>
-      <w:r>
-        <w:t xml:space="preserve"> </w:t>
-      </w:r>
-      <w:r>
-        <w:t xml:space="preserve">distribution, and can train shadow models on samples of the same population. The adversary’s goal is to decide</w:t>
-      </w:r>
-      <w:r>
-        <w:t xml:space="preserve"> </w:t>
-      </w:r>
-      <w:r>
-        <w:t xml:space="preserve">whether a given image, or a given patient, was used in training. The formal guarantee also covers every update that</w:t>
-      </w:r>
-      <w:r>
-        <w:t xml:space="preserve"> </w:t>
-      </w:r>
-      <w:r>
-        <w:t xml:space="preserve">a client sends, but the empirical audit tests only the released model, and attacks that reconstruct images from</w:t>
-      </w:r>
-      <w:r>
-        <w:t xml:space="preserve"> </w:t>
-      </w:r>
-      <w:r>
-        <w:t xml:space="preserve">individual updates</w:t>
+        <w:t xml:space="preserve">33</w:t>
+      </w:r>
+      <w:r>
+        <w:t xml:space="preserve"> </w:t>
+      </w:r>
+      <w:r>
+        <w:t xml:space="preserve">is used. A unit split across</w:t>
+      </w:r>
+      <w:r>
+        <w:t xml:space="preserve"> </w:t>
+      </w:r>
+      <m:oMath>
+        <m:r>
+          <m:t>m</m:t>
+        </m:r>
+      </m:oMath>
+      <w:r>
+        <w:t xml:space="preserve"> </w:t>
+      </w:r>
+      <w:r>
+        <w:t xml:space="preserve">clients is protected by the composition of</w:t>
+      </w:r>
+      <w:r>
+        <w:t xml:space="preserve"> </w:t>
+      </w:r>
+      <m:oMath>
+        <m:r>
+          <m:t>m</m:t>
+        </m:r>
+      </m:oMath>
+      <w:r>
+        <w:t xml:space="preserve"> </w:t>
+      </w:r>
+      <w:r>
+        <w:t xml:space="preserve">guarantees, and the worst</w:t>
+      </w:r>
+      <w:r>
+        <w:t xml:space="preserve"> </w:t>
+      </w:r>
+      <w:r>
+        <w:t xml:space="preserve">case over units is reported. Client-level DP, which hides the participation of a whole hospital,</w:t>
       </w:r>
       <w:r>
         <w:rPr>
           <w:vertAlign w:val="superscript"/>
         </w:rPr>
-        <w:t xml:space="preserve">23</w:t>
+        <w:t xml:space="preserve">34</w:t>
+      </w:r>
+      <w:r>
+        <w:t xml:space="preserve"> </w:t>
+      </w:r>
+      <w:r>
+        <w:t xml:space="preserve">was</w:t>
+      </w:r>
+      <w:r>
+        <w:t xml:space="preserve"> </w:t>
+      </w:r>
+      <w:r>
+        <w:t xml:space="preserve">not evaluated, because with three to 15 clients the noise needed to mask one client would dominate the aggregate.</w:t>
+      </w:r>
+    </w:p>
+    <w:p>
+      <w:pPr>
+        <w:pStyle w:val="BodyText"/>
+        <w:spacing w:line="480" w:lineRule="auto"/>
+        <w:jc w:val="left"/>
+      </w:pPr>
+      <w:r>
+        <w:t xml:space="preserve">The audit adversary has query access to the logits of the released model, knows the training recipe and the data</w:t>
+      </w:r>
+      <w:r>
+        <w:t xml:space="preserve"> </w:t>
+      </w:r>
+      <w:r>
+        <w:t xml:space="preserve">distribution, and can train shadow models on samples of the same population. The adversary’s goal is to decide</w:t>
+      </w:r>
+      <w:r>
+        <w:t xml:space="preserve"> </w:t>
+      </w:r>
+      <w:r>
+        <w:t xml:space="preserve">whether a given image, or a given patient, was used in training. The formal guarantee also covers every update that</w:t>
+      </w:r>
+      <w:r>
+        <w:t xml:space="preserve"> </w:t>
+      </w:r>
+      <w:r>
+        <w:t xml:space="preserve">a client sends, but the empirical audit tests only the released model, and attacks that reconstruct images from</w:t>
+      </w:r>
+      <w:r>
+        <w:t xml:space="preserve"> </w:t>
+      </w:r>
+      <w:r>
+        <w:t xml:space="preserve">individual updates</w:t>
+      </w:r>
+      <w:r>
+        <w:rPr>
+          <w:vertAlign w:val="superscript"/>
+        </w:rPr>
+        <w:t xml:space="preserve">25</w:t>
       </w:r>
       <w:r>
         <w:t xml:space="preserve"> </w:t>
@@ -2531,7 +2573,7 @@
         <w:rPr>
           <w:vertAlign w:val="superscript"/>
         </w:rPr>
-        <w:t xml:space="preserve">28,32</w:t>
+        <w:t xml:space="preserve">30,35</w:t>
       </w:r>
       <w:r>
         <w:t xml:space="preserve"> </w:t>
@@ -2543,7 +2585,7 @@
         <w:rPr>
           <w:vertAlign w:val="superscript"/>
         </w:rPr>
-        <w:t xml:space="preserve">29</w:t>
+        <w:t xml:space="preserve">31</w:t>
       </w:r>
       <w:r>
         <w:t xml:space="preserve"> </w:t>
@@ -2561,7 +2603,7 @@
         <w:rPr>
           <w:vertAlign w:val="superscript"/>
         </w:rPr>
-        <w:t xml:space="preserve">30</w:t>
+        <w:t xml:space="preserve">32</w:t>
       </w:r>
       <w:r>
         <w:t xml:space="preserve"> </w:t>
@@ -3851,7 +3893,7 @@
         <w:rPr>
           <w:vertAlign w:val="superscript"/>
         </w:rPr>
-        <w:t xml:space="preserve">7</w:t>
+        <w:t xml:space="preserve">9</w:t>
       </w:r>
       <w:r>
         <w:t xml:space="preserve"> </w:t>
@@ -5048,7 +5090,7 @@
         <w:rPr>
           <w:vertAlign w:val="superscript"/>
         </w:rPr>
-        <w:t xml:space="preserve">18</w:t>
+        <w:t xml:space="preserve">20</w:t>
       </w:r>
       <w:r>
         <w:t xml:space="preserve"> </w:t>
@@ -5066,7 +5108,7 @@
         <w:rPr>
           <w:vertAlign w:val="superscript"/>
         </w:rPr>
-        <w:t xml:space="preserve">19</w:t>
+        <w:t xml:space="preserve">21</w:t>
       </w:r>
       <w:r>
         <w:t xml:space="preserve"> </w:t>
@@ -5274,7 +5316,7 @@
         <w:rPr>
           <w:vertAlign w:val="superscript"/>
         </w:rPr>
-        <w:t xml:space="preserve">33</w:t>
+        <w:t xml:space="preserve">36</w:t>
       </w:r>
     </w:p>
     <w:bookmarkStart w:id="32" w:name="X255289e7e36ba8b3a1ae439fbcf910d8bcb03ae"/>
@@ -6423,7 +6465,7 @@
         <w:rPr>
           <w:vertAlign w:val="superscript"/>
         </w:rPr>
-        <w:t xml:space="preserve">34</w:t>
+        <w:t xml:space="preserve">37</w:t>
       </w:r>
       <w:r>
         <w:t xml:space="preserve"> </w:t>
@@ -6469,7 +6511,7 @@
         <w:rPr>
           <w:vertAlign w:val="superscript"/>
         </w:rPr>
-        <w:t xml:space="preserve">35</w:t>
+        <w:t xml:space="preserve">38</w:t>
       </w:r>
       <w:r>
         <w:t xml:space="preserve"> </w:t>
@@ -6693,7 +6735,7 @@
         <w:rPr>
           <w:vertAlign w:val="superscript"/>
         </w:rPr>
-        <w:t xml:space="preserve">11</w:t>
+        <w:t xml:space="preserve">13</w:t>
       </w:r>
       <w:r>
         <w:t xml:space="preserve"> </w:t>
@@ -6936,7 +6978,7 @@
         <w:rPr>
           <w:vertAlign w:val="superscript"/>
         </w:rPr>
-        <w:t xml:space="preserve">24</w:t>
+        <w:t xml:space="preserve">26</w:t>
       </w:r>
       <w:r>
         <w:t xml:space="preserve"> </w:t>
@@ -8071,272 +8113,272 @@
         <w:rPr>
           <w:vertAlign w:val="superscript"/>
         </w:rPr>
-        <w:t xml:space="preserve">36</w:t>
+        <w:t xml:space="preserve">39</w:t>
       </w:r>
       <w:r>
         <w:t xml:space="preserve"> </w:t>
       </w:r>
       <w:r>
         <w:t xml:space="preserve">on the last residual block, Grad-CAM++</w:t>
-      </w:r>
-      <w:r>
-        <w:rPr>
-          <w:vertAlign w:val="superscript"/>
-        </w:rPr>
-        <w:t xml:space="preserve">37</w:t>
-      </w:r>
-      <w:r>
-        <w:t xml:space="preserve"> </w:t>
-      </w:r>
-      <w:r>
-        <w:t xml:space="preserve">and Integrated Gradients</w:t>
-      </w:r>
-      <w:r>
-        <w:t xml:space="preserve"> </w:t>
-      </w:r>
-      <w:r>
-        <w:t xml:space="preserve">(IG)</w:t>
-      </w:r>
-      <w:r>
-        <w:rPr>
-          <w:vertAlign w:val="superscript"/>
-        </w:rPr>
-        <w:t xml:space="preserve">38</w:t>
-      </w:r>
-      <w:r>
-        <w:t xml:space="preserve"> </w:t>
-      </w:r>
-      <w:r>
-        <w:t xml:space="preserve">with a black baseline and 32 steps were computed for the true class of the 645 Figshare</w:t>
-      </w:r>
-      <w:r>
-        <w:t xml:space="preserve"> </w:t>
-      </w:r>
-      <w:r>
-        <w:t xml:space="preserve">test tumour images that have expert masks. At</w:t>
-      </w:r>
-      <w:r>
-        <w:t xml:space="preserve"> </w:t>
-      </w:r>
-      <m:oMath>
-        <m:r>
-          <m:t>128</m:t>
-        </m:r>
-        <m:r>
-          <m:rPr>
-            <m:sty m:val="p"/>
-          </m:rPr>
-          <m:t>×</m:t>
-        </m:r>
-        <m:r>
-          <m:t>128</m:t>
-        </m:r>
-      </m:oMath>
-      <w:r>
-        <w:t xml:space="preserve"> </w:t>
-      </w:r>
-      <w:r>
-        <w:t xml:space="preserve">input the last block has</w:t>
-      </w:r>
-      <w:r>
-        <w:t xml:space="preserve"> </w:t>
-      </w:r>
-      <m:oMath>
-        <m:r>
-          <m:t>4</m:t>
-        </m:r>
-        <m:r>
-          <m:rPr>
-            <m:sty m:val="p"/>
-          </m:rPr>
-          <m:t>×</m:t>
-        </m:r>
-        <m:r>
-          <m:t>4</m:t>
-        </m:r>
-      </m:oMath>
-      <w:r>
-        <w:t xml:space="preserve"> </w:t>
-      </w:r>
-      <w:r>
-        <w:t xml:space="preserve">resolution, and maps</w:t>
-      </w:r>
-      <w:r>
-        <w:t xml:space="preserve"> </w:t>
-      </w:r>
-      <w:r>
-        <w:t xml:space="preserve">are upsampled bilinearly. Localisation used the pointing game with a 3-pixel tolerance, the intersection over union</w:t>
-      </w:r>
-      <w:r>
-        <w:t xml:space="preserve"> </w:t>
-      </w:r>
-      <w:r>
-        <w:t xml:space="preserve">(IoU) of the top 15% of pixels with the mask and the share of saliency inside the mask, on correctly classified</w:t>
-      </w:r>
-      <w:r>
-        <w:t xml:space="preserve"> </w:t>
-      </w:r>
-      <w:r>
-        <w:t xml:space="preserve">images.</w:t>
-      </w:r>
-    </w:p>
-    <w:p>
-      <w:pPr>
-        <w:pStyle w:val="BodyText"/>
-        <w:spacing w:line="480" w:lineRule="auto"/>
-        <w:jc w:val="left"/>
-      </w:pPr>
-      <w:r>
-        <w:t xml:space="preserve">Faithfulness used deletion and insertion curves over 20 steps.</w:t>
-      </w:r>
-      <w:r>
-        <w:rPr>
-          <w:vertAlign w:val="superscript"/>
-        </w:rPr>
-        <w:t xml:space="preserve">39</w:t>
-      </w:r>
-      <w:r>
-        <w:t xml:space="preserve"> </w:t>
-      </w:r>
-      <w:r>
-        <w:t xml:space="preserve">A model-parameter randomisation</w:t>
-      </w:r>
-      <w:r>
-        <w:t xml:space="preserve"> </w:t>
-      </w:r>
-      <w:r>
-        <w:t xml:space="preserve">test</w:t>
-      </w:r>
-      <w:r>
-        <w:rPr>
-          <w:vertAlign w:val="superscript"/>
-        </w:rPr>
-        <w:t xml:space="preserve">27</w:t>
-      </w:r>
-      <w:r>
-        <w:t xml:space="preserve"> </w:t>
-      </w:r>
-      <w:r>
-        <w:t xml:space="preserve">on 64 images compared maps of each trained model with those of a fully re-initialised network.</w:t>
-      </w:r>
-      <w:r>
-        <w:t xml:space="preserve"> </w:t>
-      </w:r>
-      <w:r>
-        <w:t xml:space="preserve">The share of Grad-CAM mass on the outer 8-pixel rim of the brain tested for skull-border artefacts. Consistency</w:t>
-      </w:r>
-      <w:r>
-        <w:t xml:space="preserve"> </w:t>
-      </w:r>
-      <w:r>
-        <w:t xml:space="preserve">across seeds adapts the metric of Gupta et al.,</w:t>
-      </w:r>
-      <w:r>
-        <w:rPr>
-          <w:vertAlign w:val="superscript"/>
-        </w:rPr>
-        <w:t xml:space="preserve">11</w:t>
-      </w:r>
-      <w:r>
-        <w:t xml:space="preserve"> </w:t>
-      </w:r>
-      <w:r>
-        <w:t xml:space="preserve">with the seeds of one configuration in place of</w:t>
-      </w:r>
-      <w:r>
-        <w:t xml:space="preserve"> </w:t>
-      </w:r>
-      <w:r>
-        <w:t xml:space="preserve">clients, five for central and three for federated configurations. It is the IoU between the top 10% of pixels of each</w:t>
-      </w:r>
-      <w:r>
-        <w:t xml:space="preserve"> </w:t>
-      </w:r>
-      <w:r>
-        <w:t xml:space="preserve">model’s</w:t>
-      </w:r>
-      <w:r>
-        <w:t xml:space="preserve"> </w:t>
-      </w:r>
-      <m:oMath>
-        <m:r>
-          <m:t>8</m:t>
-        </m:r>
-        <m:r>
-          <m:rPr>
-            <m:sty m:val="p"/>
-          </m:rPr>
-          <m:t>×</m:t>
-        </m:r>
-        <m:r>
-          <m:t>8</m:t>
-        </m:r>
-      </m:oMath>
-      <w:r>
-        <w:t xml:space="preserve"> </w:t>
-      </w:r>
-      <w:r>
-        <w:t xml:space="preserve">Grad-CAM map and those of the mean map over seeds.</w:t>
-      </w:r>
-    </w:p>
-    <w:bookmarkEnd w:id="37"/>
-    <w:bookmarkStart w:id="38" w:name="experimental-setup"/>
-    <w:p>
-      <w:pPr>
-        <w:pStyle w:val="Heading2"/>
-        <w:spacing w:line="480" w:lineRule="auto"/>
-        <w:jc w:val="left"/>
-      </w:pPr>
-      <w:r>
-        <w:t xml:space="preserve">Experimental setup</w:t>
-      </w:r>
-    </w:p>
-    <w:p>
-      <w:pPr>
-        <w:pStyle w:val="FirstParagraph"/>
-        <w:spacing w:line="480" w:lineRule="auto"/>
-        <w:jc w:val="left"/>
-      </w:pPr>
-      <w:r>
-        <w:t xml:space="preserve">Table 1 gives the data per source. The natural partition assigns each source to one client, giving</w:t>
-      </w:r>
-      <w:r>
-        <w:t xml:space="preserve"> </w:t>
-      </w:r>
-      <w:r>
-        <w:t xml:space="preserve">clients of 2029 (Figshare), 351 (SARTAJ) and 230 (Br35H) training images with strong label skew, since no-tumour</w:t>
-      </w:r>
-      <w:r>
-        <w:t xml:space="preserve"> </w:t>
-      </w:r>
-      <w:r>
-        <w:t xml:space="preserve">images come only from SARTAJ and Br35H. Synthetic partitions split the same 2610 images into 10 clients uniformly at</w:t>
-      </w:r>
-      <w:r>
-        <w:t xml:space="preserve"> </w:t>
-      </w:r>
-      <w:r>
-        <w:t xml:space="preserve">random or by a Dirichlet prior over class proportions with</w:t>
-      </w:r>
-      <w:r>
-        <w:t xml:space="preserve"> </w:t>
-      </w:r>
-      <m:oMath>
-        <m:r>
-          <m:t>α</m:t>
-        </m:r>
-      </m:oMath>
-      <w:r>
-        <w:t xml:space="preserve"> </w:t>
-      </w:r>
-      <w:r>
-        <w:t xml:space="preserve">of 0.1, 0.5 or 5.0.</w:t>
       </w:r>
       <w:r>
         <w:rPr>
           <w:vertAlign w:val="superscript"/>
         </w:rPr>
         <w:t xml:space="preserve">40</w:t>
+      </w:r>
+      <w:r>
+        <w:t xml:space="preserve"> </w:t>
+      </w:r>
+      <w:r>
+        <w:t xml:space="preserve">and Integrated Gradients</w:t>
+      </w:r>
+      <w:r>
+        <w:t xml:space="preserve"> </w:t>
+      </w:r>
+      <w:r>
+        <w:t xml:space="preserve">(IG)</w:t>
+      </w:r>
+      <w:r>
+        <w:rPr>
+          <w:vertAlign w:val="superscript"/>
+        </w:rPr>
+        <w:t xml:space="preserve">41</w:t>
+      </w:r>
+      <w:r>
+        <w:t xml:space="preserve"> </w:t>
+      </w:r>
+      <w:r>
+        <w:t xml:space="preserve">with a black baseline and 32 steps were computed for the true class of the 645 Figshare</w:t>
+      </w:r>
+      <w:r>
+        <w:t xml:space="preserve"> </w:t>
+      </w:r>
+      <w:r>
+        <w:t xml:space="preserve">test tumour images that have expert masks. At</w:t>
+      </w:r>
+      <w:r>
+        <w:t xml:space="preserve"> </w:t>
+      </w:r>
+      <m:oMath>
+        <m:r>
+          <m:t>128</m:t>
+        </m:r>
+        <m:r>
+          <m:rPr>
+            <m:sty m:val="p"/>
+          </m:rPr>
+          <m:t>×</m:t>
+        </m:r>
+        <m:r>
+          <m:t>128</m:t>
+        </m:r>
+      </m:oMath>
+      <w:r>
+        <w:t xml:space="preserve"> </w:t>
+      </w:r>
+      <w:r>
+        <w:t xml:space="preserve">input the last block has</w:t>
+      </w:r>
+      <w:r>
+        <w:t xml:space="preserve"> </w:t>
+      </w:r>
+      <m:oMath>
+        <m:r>
+          <m:t>4</m:t>
+        </m:r>
+        <m:r>
+          <m:rPr>
+            <m:sty m:val="p"/>
+          </m:rPr>
+          <m:t>×</m:t>
+        </m:r>
+        <m:r>
+          <m:t>4</m:t>
+        </m:r>
+      </m:oMath>
+      <w:r>
+        <w:t xml:space="preserve"> </w:t>
+      </w:r>
+      <w:r>
+        <w:t xml:space="preserve">resolution, and maps</w:t>
+      </w:r>
+      <w:r>
+        <w:t xml:space="preserve"> </w:t>
+      </w:r>
+      <w:r>
+        <w:t xml:space="preserve">are upsampled bilinearly. Localisation used the pointing game with a 3-pixel tolerance, the intersection over union</w:t>
+      </w:r>
+      <w:r>
+        <w:t xml:space="preserve"> </w:t>
+      </w:r>
+      <w:r>
+        <w:t xml:space="preserve">(IoU) of the top 15% of pixels with the mask and the share of saliency inside the mask, on correctly classified</w:t>
+      </w:r>
+      <w:r>
+        <w:t xml:space="preserve"> </w:t>
+      </w:r>
+      <w:r>
+        <w:t xml:space="preserve">images.</w:t>
+      </w:r>
+    </w:p>
+    <w:p>
+      <w:pPr>
+        <w:pStyle w:val="BodyText"/>
+        <w:spacing w:line="480" w:lineRule="auto"/>
+        <w:jc w:val="left"/>
+      </w:pPr>
+      <w:r>
+        <w:t xml:space="preserve">Faithfulness used deletion and insertion curves over 20 steps.</w:t>
+      </w:r>
+      <w:r>
+        <w:rPr>
+          <w:vertAlign w:val="superscript"/>
+        </w:rPr>
+        <w:t xml:space="preserve">42</w:t>
+      </w:r>
+      <w:r>
+        <w:t xml:space="preserve"> </w:t>
+      </w:r>
+      <w:r>
+        <w:t xml:space="preserve">A model-parameter randomisation</w:t>
+      </w:r>
+      <w:r>
+        <w:t xml:space="preserve"> </w:t>
+      </w:r>
+      <w:r>
+        <w:t xml:space="preserve">test</w:t>
+      </w:r>
+      <w:r>
+        <w:rPr>
+          <w:vertAlign w:val="superscript"/>
+        </w:rPr>
+        <w:t xml:space="preserve">29</w:t>
+      </w:r>
+      <w:r>
+        <w:t xml:space="preserve"> </w:t>
+      </w:r>
+      <w:r>
+        <w:t xml:space="preserve">on 64 images compared maps of each trained model with those of a fully re-initialised network.</w:t>
+      </w:r>
+      <w:r>
+        <w:t xml:space="preserve"> </w:t>
+      </w:r>
+      <w:r>
+        <w:t xml:space="preserve">The share of Grad-CAM mass on the outer 8-pixel rim of the brain tested for skull-border artefacts. Consistency</w:t>
+      </w:r>
+      <w:r>
+        <w:t xml:space="preserve"> </w:t>
+      </w:r>
+      <w:r>
+        <w:t xml:space="preserve">across seeds adapts the metric of Gupta et al.,</w:t>
+      </w:r>
+      <w:r>
+        <w:rPr>
+          <w:vertAlign w:val="superscript"/>
+        </w:rPr>
+        <w:t xml:space="preserve">13</w:t>
+      </w:r>
+      <w:r>
+        <w:t xml:space="preserve"> </w:t>
+      </w:r>
+      <w:r>
+        <w:t xml:space="preserve">with the seeds of one configuration in place of</w:t>
+      </w:r>
+      <w:r>
+        <w:t xml:space="preserve"> </w:t>
+      </w:r>
+      <w:r>
+        <w:t xml:space="preserve">clients, five for central and three for federated configurations. It is the IoU between the top 10% of pixels of each</w:t>
+      </w:r>
+      <w:r>
+        <w:t xml:space="preserve"> </w:t>
+      </w:r>
+      <w:r>
+        <w:t xml:space="preserve">model’s</w:t>
+      </w:r>
+      <w:r>
+        <w:t xml:space="preserve"> </w:t>
+      </w:r>
+      <m:oMath>
+        <m:r>
+          <m:t>8</m:t>
+        </m:r>
+        <m:r>
+          <m:rPr>
+            <m:sty m:val="p"/>
+          </m:rPr>
+          <m:t>×</m:t>
+        </m:r>
+        <m:r>
+          <m:t>8</m:t>
+        </m:r>
+      </m:oMath>
+      <w:r>
+        <w:t xml:space="preserve"> </w:t>
+      </w:r>
+      <w:r>
+        <w:t xml:space="preserve">Grad-CAM map and those of the mean map over seeds.</w:t>
+      </w:r>
+    </w:p>
+    <w:bookmarkEnd w:id="37"/>
+    <w:bookmarkStart w:id="38" w:name="experimental-setup"/>
+    <w:p>
+      <w:pPr>
+        <w:pStyle w:val="Heading2"/>
+        <w:spacing w:line="480" w:lineRule="auto"/>
+        <w:jc w:val="left"/>
+      </w:pPr>
+      <w:r>
+        <w:t xml:space="preserve">Experimental setup</w:t>
+      </w:r>
+    </w:p>
+    <w:p>
+      <w:pPr>
+        <w:pStyle w:val="FirstParagraph"/>
+        <w:spacing w:line="480" w:lineRule="auto"/>
+        <w:jc w:val="left"/>
+      </w:pPr>
+      <w:r>
+        <w:t xml:space="preserve">Table 1 gives the data per source. The natural partition assigns each source to one client, giving</w:t>
+      </w:r>
+      <w:r>
+        <w:t xml:space="preserve"> </w:t>
+      </w:r>
+      <w:r>
+        <w:t xml:space="preserve">clients of 2029 (Figshare), 351 (SARTAJ) and 230 (Br35H) training images with strong label skew, since no-tumour</w:t>
+      </w:r>
+      <w:r>
+        <w:t xml:space="preserve"> </w:t>
+      </w:r>
+      <w:r>
+        <w:t xml:space="preserve">images come only from SARTAJ and Br35H. Synthetic partitions split the same 2610 images into 10 clients uniformly at</w:t>
+      </w:r>
+      <w:r>
+        <w:t xml:space="preserve"> </w:t>
+      </w:r>
+      <w:r>
+        <w:t xml:space="preserve">random or by a Dirichlet prior over class proportions with</w:t>
+      </w:r>
+      <w:r>
+        <w:t xml:space="preserve"> </w:t>
+      </w:r>
+      <m:oMath>
+        <m:r>
+          <m:t>α</m:t>
+        </m:r>
+      </m:oMath>
+      <w:r>
+        <w:t xml:space="preserve"> </w:t>
+      </w:r>
+      <w:r>
+        <w:t xml:space="preserve">of 0.1, 0.5 or 5.0.</w:t>
+      </w:r>
+      <w:r>
+        <w:rPr>
+          <w:vertAlign w:val="superscript"/>
+        </w:rPr>
+        <w:t xml:space="preserve">43</w:t>
       </w:r>
       <w:r>
         <w:t xml:space="preserve"> </w:t>
@@ -8993,7 +9035,7 @@
         <w:rPr>
           <w:vertAlign w:val="superscript"/>
         </w:rPr>
-        <w:t xml:space="preserve">41</w:t>
+        <w:t xml:space="preserve">44</w:t>
       </w:r>
       <w:r>
         <w:t xml:space="preserve"> </w:t>
@@ -12239,7 +12281,7 @@
         <w:rPr>
           <w:vertAlign w:val="superscript"/>
         </w:rPr>
-        <w:t xml:space="preserve">42</w:t>
+        <w:t xml:space="preserve">45</w:t>
       </w:r>
       <w:r>
         <w:t xml:space="preserve"> </w:t>
@@ -15554,7 +15596,7 @@
         <w:rPr>
           <w:vertAlign w:val="superscript"/>
         </w:rPr>
-        <w:t xml:space="preserve">23</w:t>
+        <w:t xml:space="preserve">25</w:t>
       </w:r>
       <w:r>
         <w:t xml:space="preserve"> </w:t>
@@ -15680,7 +15722,7 @@
         <w:rPr>
           <w:vertAlign w:val="superscript"/>
         </w:rPr>
-        <w:t xml:space="preserve">11</w:t>
+        <w:t xml:space="preserve">13</w:t>
       </w:r>
     </w:p>
     <w:bookmarkEnd w:id="64"/>
@@ -15721,361 +15763,6 @@
       </w:r>
       <w:r>
         <w:t xml:space="preserve">patients with several records carry the real privacy risk,</w:t>
-      </w:r>
-      <w:r>
-        <w:rPr>
-          <w:vertAlign w:val="superscript"/>
-        </w:rPr>
-        <w:t xml:space="preserve">6</w:t>
-      </w:r>
-      <w:r>
-        <w:t xml:space="preserve"> </w:t>
-      </w:r>
-      <w:r>
-        <w:t xml:space="preserve">and suggests that a larger number of</w:t>
-      </w:r>
-      <w:r>
-        <w:t xml:space="preserve"> </w:t>
-      </w:r>
-      <w:r>
-        <w:t xml:space="preserve">patients is the most direct route to useful per-patient guarantees.</w:t>
-      </w:r>
-    </w:p>
-    <w:bookmarkEnd w:id="65"/>
-    <w:bookmarkStart w:id="66" w:name="client-count-and-drift-correction"/>
-    <w:p>
-      <w:pPr>
-        <w:pStyle w:val="Heading2"/>
-        <w:spacing w:line="480" w:lineRule="auto"/>
-        <w:jc w:val="left"/>
-      </w:pPr>
-      <w:r>
-        <w:t xml:space="preserve">Client count and drift correction</w:t>
-      </w:r>
-    </w:p>
-    <w:p>
-      <w:pPr>
-        <w:pStyle w:val="FirstParagraph"/>
-        <w:spacing w:line="480" w:lineRule="auto"/>
-        <w:jc w:val="left"/>
-      </w:pPr>
-      <w:r>
-        <w:t xml:space="preserve">Under DP, accuracy fell as the same data were spread across more clients, while label skew changed accuracy at</w:t>
-      </w:r>
-      <w:r>
-        <w:t xml:space="preserve"> </w:t>
-      </w:r>
-      <m:oMath>
-        <m:r>
-          <m:t>K</m:t>
-        </m:r>
-        <m:r>
-          <m:rPr>
-            <m:sty m:val="p"/>
-          </m:rPr>
-          <m:t>=</m:t>
-        </m:r>
-        <m:r>
-          <m:t>10</m:t>
-        </m:r>
-      </m:oMath>
-      <w:r>
-        <w:t xml:space="preserve"> </w:t>
-      </w:r>
-      <w:r>
-        <w:t xml:space="preserve">and</w:t>
-      </w:r>
-      <w:r>
-        <w:t xml:space="preserve"> </w:t>
-      </w:r>
-      <m:oMath>
-        <m:r>
-          <m:t>ε</m:t>
-        </m:r>
-        <m:r>
-          <m:rPr>
-            <m:sty m:val="p"/>
-          </m:rPr>
-          <m:t>=</m:t>
-        </m:r>
-        <m:r>
-          <m:t>3</m:t>
-        </m:r>
-      </m:oMath>
-      <w:r>
-        <w:t xml:space="preserve"> </w:t>
-      </w:r>
-      <w:r>
-        <w:t xml:space="preserve">by at most 0.010 (</w:t>
-      </w:r>
-      <m:oMath>
-        <m:r>
-          <m:t>0.593</m:t>
-        </m:r>
-        <m:r>
-          <m:rPr>
-            <m:sty m:val="p"/>
-          </m:rPr>
-          <m:t>−</m:t>
-        </m:r>
-        <m:r>
-          <m:t>0.583</m:t>
-        </m:r>
-      </m:oMath>
-      <w:r>
-        <w:t xml:space="preserve">). The trend is consistent with Eq. (4), because</w:t>
-      </w:r>
-      <w:r>
-        <w:t xml:space="preserve"> </w:t>
-      </w:r>
-      <w:r>
-        <w:t xml:space="preserve">each client adds independent noise without adding data. The arithmetic is standard for DP-SGD and is not claimed as new. It</w:t>
-      </w:r>
-      <w:r>
-        <w:t xml:space="preserve"> </w:t>
-      </w:r>
-      <w:r>
-        <w:t xml:space="preserve">implies that consortia of few large sites lose least, and that a learning rate tuned for one client count can hide</w:t>
-      </w:r>
-      <w:r>
-        <w:t xml:space="preserve"> </w:t>
-      </w:r>
-      <w:r>
-        <w:t xml:space="preserve">the effect at another.</w:t>
-      </w:r>
-    </w:p>
-    <w:p>
-      <w:pPr>
-        <w:pStyle w:val="BodyText"/>
-        <w:spacing w:line="480" w:lineRule="auto"/>
-        <w:jc w:val="left"/>
-      </w:pPr>
-      <w:r>
-        <w:t xml:space="preserve">Drift correction likely did not help because one local epoch per round produced little drift, while noise dominated the</w:t>
-      </w:r>
-      <w:r>
-        <w:t xml:space="preserve"> </w:t>
-      </w:r>
-      <w:r>
-        <w:t xml:space="preserve">error. The SCAFFOLD ablation also indicates that control variates must be averaged with the same weights as the model,</w:t>
-      </w:r>
-      <w:r>
-        <w:t xml:space="preserve"> </w:t>
-      </w:r>
-      <w:r>
-        <w:t xml:space="preserve">or the correction harms the unequal and noisy settings in which it is most needed.</w:t>
-      </w:r>
-    </w:p>
-    <w:bookmarkEnd w:id="66"/>
-    <w:bookmarkStart w:id="67" w:name="explanations-under-privacy"/>
-    <w:p>
-      <w:pPr>
-        <w:pStyle w:val="Heading2"/>
-        <w:spacing w:line="480" w:lineRule="auto"/>
-        <w:jc w:val="left"/>
-      </w:pPr>
-      <w:r>
-        <w:t xml:space="preserve">Explanations under privacy</w:t>
-      </w:r>
-    </w:p>
-    <w:p>
-      <w:pPr>
-        <w:pStyle w:val="FirstParagraph"/>
-        <w:spacing w:line="480" w:lineRule="auto"/>
-        <w:jc w:val="left"/>
-      </w:pPr>
-      <w:r>
-        <w:t xml:space="preserve">DP degraded Grad-CAM localisation and cross-seed consistency, in line with reports on attribution methods in</w:t>
-      </w:r>
-      <w:r>
-        <w:t xml:space="preserve"> </w:t>
-      </w:r>
-      <w:r>
-        <w:t xml:space="preserve">general.</w:t>
-      </w:r>
-      <w:r>
-        <w:rPr>
-          <w:vertAlign w:val="superscript"/>
-        </w:rPr>
-        <w:t xml:space="preserve">25,26</w:t>
-      </w:r>
-      <w:r>
-        <w:t xml:space="preserve"> </w:t>
-      </w:r>
-      <w:r>
-        <w:t xml:space="preserve">For brain tumour MRI, the degradation followed accuracy (</w:t>
-      </w:r>
-      <m:oMath>
-        <m:r>
-          <m:t>r</m:t>
-        </m:r>
-        <m:r>
-          <m:rPr>
-            <m:sty m:val="p"/>
-          </m:rPr>
-          <m:t>=</m:t>
-        </m:r>
-        <m:r>
-          <m:t>0.838</m:t>
-        </m:r>
-      </m:oMath>
-      <w:r>
-        <w:t xml:space="preserve"> </w:t>
-      </w:r>
-      <w:r>
-        <w:t xml:space="preserve">for</w:t>
-      </w:r>
-      <w:r>
-        <w:t xml:space="preserve"> </w:t>
-      </w:r>
-      <w:r>
-        <w:t xml:space="preserve">consistency and</w:t>
-      </w:r>
-      <w:r>
-        <w:t xml:space="preserve"> </w:t>
-      </w:r>
-      <m:oMath>
-        <m:r>
-          <m:t>r</m:t>
-        </m:r>
-        <m:r>
-          <m:rPr>
-            <m:sty m:val="p"/>
-          </m:rPr>
-          <m:t>=</m:t>
-        </m:r>
-        <m:r>
-          <m:t>0.903</m:t>
-        </m:r>
-      </m:oMath>
-      <w:r>
-        <w:t xml:space="preserve"> </w:t>
-      </w:r>
-      <w:r>
-        <w:t xml:space="preserve">for IoU across configurations), and</w:t>
-      </w:r>
-      <w:r>
-        <w:t xml:space="preserve"> </w:t>
-      </w:r>
-      <m:oMath>
-        <m:r>
-          <m:t>σ</m:t>
-        </m:r>
-      </m:oMath>
-      <w:r>
-        <w:t xml:space="preserve"> </w:t>
-      </w:r>
-      <w:r>
-        <w:t xml:space="preserve">added nothing once accuracy was known. The</w:t>
-      </w:r>
-      <w:r>
-        <w:t xml:space="preserve"> </w:t>
-      </w:r>
-      <w:r>
-        <w:t xml:space="preserve">small change under clipping alone (0.700 to 0.663) suggests that noise affects explanations mainly through the</w:t>
-      </w:r>
-      <w:r>
-        <w:t xml:space="preserve"> </w:t>
-      </w:r>
-      <w:r>
-        <w:t xml:space="preserve">accuracy it costs, although the correlational design cannot establish that pathway.</w:t>
-      </w:r>
-    </w:p>
-    <w:p>
-      <w:pPr>
-        <w:pStyle w:val="BodyText"/>
-        <w:spacing w:line="480" w:lineRule="auto"/>
-        <w:jc w:val="left"/>
-      </w:pPr>
-      <w:r>
-        <w:t xml:space="preserve">The low absolute localisation, with a pointing hit rate of 0.197 even without DP, is consistent with the</w:t>
-      </w:r>
-      <w:r>
-        <w:t xml:space="preserve"> </w:t>
-      </w:r>
-      <m:oMath>
-        <m:r>
-          <m:t>4</m:t>
-        </m:r>
-        <m:r>
-          <m:rPr>
-            <m:sty m:val="p"/>
-          </m:rPr>
-          <m:t>×</m:t>
-        </m:r>
-        <m:r>
-          <m:t>4</m:t>
-        </m:r>
-      </m:oMath>
-      <w:r>
-        <w:t xml:space="preserve"> </w:t>
-      </w:r>
-      <w:r>
-        <w:t xml:space="preserve">resolution of the last ResNet block at 128-pixel input. Clinically, DP cost most in meningioma and no-tumour</w:t>
-      </w:r>
-      <w:r>
-        <w:t xml:space="preserve"> </w:t>
-      </w:r>
-      <w:r>
-        <w:t xml:space="preserve">sensitivity while missed tumours stayed rare (Table 4), so a private model would mainly need review of</w:t>
-      </w:r>
-      <w:r>
-        <w:t xml:space="preserve"> </w:t>
-      </w:r>
-      <w:r>
-        <w:t xml:space="preserve">its tumour-type calls. IG with a black baseline failed the randomisation test, which argues against</w:t>
-      </w:r>
-      <w:r>
-        <w:t xml:space="preserve"> </w:t>
-      </w:r>
-      <w:r>
-        <w:t xml:space="preserve">reporting such maps without that check.</w:t>
-      </w:r>
-      <w:r>
-        <w:rPr>
-          <w:vertAlign w:val="superscript"/>
-        </w:rPr>
-        <w:t xml:space="preserve">27</w:t>
-      </w:r>
-    </w:p>
-    <w:bookmarkEnd w:id="67"/>
-    <w:bookmarkStart w:id="68" w:name="benchmark-leakage-and-source-confounding"/>
-    <w:p>
-      <w:pPr>
-        <w:pStyle w:val="Heading2"/>
-        <w:spacing w:line="480" w:lineRule="auto"/>
-        <w:jc w:val="left"/>
-      </w:pPr>
-      <w:r>
-        <w:t xml:space="preserve">Benchmark leakage and source confounding</w:t>
-      </w:r>
-    </w:p>
-    <w:p>
-      <w:pPr>
-        <w:pStyle w:val="FirstParagraph"/>
-        <w:spacing w:line="480" w:lineRule="auto"/>
-        <w:jc w:val="left"/>
-      </w:pPr>
-      <w:r>
-        <w:t xml:space="preserve">The correlation check found mirrored duplicates that perceptual hashing missed, concentrated in the Br35H no-tumour</w:t>
-      </w:r>
-      <w:r>
-        <w:t xml:space="preserve"> </w:t>
-      </w:r>
-      <w:r>
-        <w:t xml:space="preserve">class, and training with random flips can then show a model the exact test image. Source was also decodable from images</w:t>
-      </w:r>
-      <w:r>
-        <w:t xml:space="preserve"> </w:t>
-      </w:r>
-      <w:r>
-        <w:t xml:space="preserve">of one class even by a random network, so headline accuracy on merged collections partly measures which collection an</w:t>
-      </w:r>
-      <w:r>
-        <w:t xml:space="preserve"> </w:t>
-      </w:r>
-      <w:r>
-        <w:t xml:space="preserve">image came from, as Vangala et al. reported for centralised benchmarks.</w:t>
       </w:r>
       <w:r>
         <w:rPr>
@@ -16087,19 +15774,374 @@
         <w:t xml:space="preserve"> </w:t>
       </w:r>
       <w:r>
-        <w:t xml:space="preserve">Accuracies reported on these</w:t>
-      </w:r>
-      <w:r>
-        <w:t xml:space="preserve"> </w:t>
-      </w:r>
-      <w:r>
-        <w:t xml:space="preserve">collections</w:t>
+        <w:t xml:space="preserve">and suggests that a larger number of</w:t>
+      </w:r>
+      <w:r>
+        <w:t xml:space="preserve"> </w:t>
+      </w:r>
+      <w:r>
+        <w:t xml:space="preserve">patients is the most direct route to useful per-patient guarantees.</w:t>
+      </w:r>
+    </w:p>
+    <w:bookmarkEnd w:id="65"/>
+    <w:bookmarkStart w:id="66" w:name="client-count-and-drift-correction"/>
+    <w:p>
+      <w:pPr>
+        <w:pStyle w:val="Heading2"/>
+        <w:spacing w:line="480" w:lineRule="auto"/>
+        <w:jc w:val="left"/>
+      </w:pPr>
+      <w:r>
+        <w:t xml:space="preserve">Client count and drift correction</w:t>
+      </w:r>
+    </w:p>
+    <w:p>
+      <w:pPr>
+        <w:pStyle w:val="FirstParagraph"/>
+        <w:spacing w:line="480" w:lineRule="auto"/>
+        <w:jc w:val="left"/>
+      </w:pPr>
+      <w:r>
+        <w:t xml:space="preserve">Under DP, accuracy fell as the same data were spread across more clients, while label skew changed accuracy at</w:t>
+      </w:r>
+      <w:r>
+        <w:t xml:space="preserve"> </w:t>
+      </w:r>
+      <m:oMath>
+        <m:r>
+          <m:t>K</m:t>
+        </m:r>
+        <m:r>
+          <m:rPr>
+            <m:sty m:val="p"/>
+          </m:rPr>
+          <m:t>=</m:t>
+        </m:r>
+        <m:r>
+          <m:t>10</m:t>
+        </m:r>
+      </m:oMath>
+      <w:r>
+        <w:t xml:space="preserve"> </w:t>
+      </w:r>
+      <w:r>
+        <w:t xml:space="preserve">and</w:t>
+      </w:r>
+      <w:r>
+        <w:t xml:space="preserve"> </w:t>
+      </w:r>
+      <m:oMath>
+        <m:r>
+          <m:t>ε</m:t>
+        </m:r>
+        <m:r>
+          <m:rPr>
+            <m:sty m:val="p"/>
+          </m:rPr>
+          <m:t>=</m:t>
+        </m:r>
+        <m:r>
+          <m:t>3</m:t>
+        </m:r>
+      </m:oMath>
+      <w:r>
+        <w:t xml:space="preserve"> </w:t>
+      </w:r>
+      <w:r>
+        <w:t xml:space="preserve">by at most 0.010 (</w:t>
+      </w:r>
+      <m:oMath>
+        <m:r>
+          <m:t>0.593</m:t>
+        </m:r>
+        <m:r>
+          <m:rPr>
+            <m:sty m:val="p"/>
+          </m:rPr>
+          <m:t>−</m:t>
+        </m:r>
+        <m:r>
+          <m:t>0.583</m:t>
+        </m:r>
+      </m:oMath>
+      <w:r>
+        <w:t xml:space="preserve">). The trend is consistent with Eq. (4), because</w:t>
+      </w:r>
+      <w:r>
+        <w:t xml:space="preserve"> </w:t>
+      </w:r>
+      <w:r>
+        <w:t xml:space="preserve">each client adds independent noise without adding data. The arithmetic is standard for DP-SGD and is not claimed as new. It</w:t>
+      </w:r>
+      <w:r>
+        <w:t xml:space="preserve"> </w:t>
+      </w:r>
+      <w:r>
+        <w:t xml:space="preserve">implies that consortia of few large sites lose least, and that a learning rate tuned for one client count can hide</w:t>
+      </w:r>
+      <w:r>
+        <w:t xml:space="preserve"> </w:t>
+      </w:r>
+      <w:r>
+        <w:t xml:space="preserve">the effect at another.</w:t>
+      </w:r>
+    </w:p>
+    <w:p>
+      <w:pPr>
+        <w:pStyle w:val="BodyText"/>
+        <w:spacing w:line="480" w:lineRule="auto"/>
+        <w:jc w:val="left"/>
+      </w:pPr>
+      <w:r>
+        <w:t xml:space="preserve">Drift correction likely did not help because one local epoch per round produced little drift, while noise dominated the</w:t>
+      </w:r>
+      <w:r>
+        <w:t xml:space="preserve"> </w:t>
+      </w:r>
+      <w:r>
+        <w:t xml:space="preserve">error. The SCAFFOLD ablation also indicates that control variates must be averaged with the same weights as the model,</w:t>
+      </w:r>
+      <w:r>
+        <w:t xml:space="preserve"> </w:t>
+      </w:r>
+      <w:r>
+        <w:t xml:space="preserve">or the correction harms the unequal and noisy settings in which it is most needed.</w:t>
+      </w:r>
+    </w:p>
+    <w:bookmarkEnd w:id="66"/>
+    <w:bookmarkStart w:id="67" w:name="explanations-under-privacy"/>
+    <w:p>
+      <w:pPr>
+        <w:pStyle w:val="Heading2"/>
+        <w:spacing w:line="480" w:lineRule="auto"/>
+        <w:jc w:val="left"/>
+      </w:pPr>
+      <w:r>
+        <w:t xml:space="preserve">Explanations under privacy</w:t>
+      </w:r>
+    </w:p>
+    <w:p>
+      <w:pPr>
+        <w:pStyle w:val="FirstParagraph"/>
+        <w:spacing w:line="480" w:lineRule="auto"/>
+        <w:jc w:val="left"/>
+      </w:pPr>
+      <w:r>
+        <w:t xml:space="preserve">DP degraded Grad-CAM localisation and cross-seed consistency, in line with reports on attribution methods in</w:t>
+      </w:r>
+      <w:r>
+        <w:t xml:space="preserve"> </w:t>
+      </w:r>
+      <w:r>
+        <w:t xml:space="preserve">general.</w:t>
       </w:r>
       <w:r>
         <w:rPr>
           <w:vertAlign w:val="superscript"/>
         </w:rPr>
-        <w:t xml:space="preserve">13-16</w:t>
+        <w:t xml:space="preserve">27,28</w:t>
+      </w:r>
+      <w:r>
+        <w:t xml:space="preserve"> </w:t>
+      </w:r>
+      <w:r>
+        <w:t xml:space="preserve">For brain tumour MRI, the degradation followed accuracy (</w:t>
+      </w:r>
+      <m:oMath>
+        <m:r>
+          <m:t>r</m:t>
+        </m:r>
+        <m:r>
+          <m:rPr>
+            <m:sty m:val="p"/>
+          </m:rPr>
+          <m:t>=</m:t>
+        </m:r>
+        <m:r>
+          <m:t>0.838</m:t>
+        </m:r>
+      </m:oMath>
+      <w:r>
+        <w:t xml:space="preserve"> </w:t>
+      </w:r>
+      <w:r>
+        <w:t xml:space="preserve">for</w:t>
+      </w:r>
+      <w:r>
+        <w:t xml:space="preserve"> </w:t>
+      </w:r>
+      <w:r>
+        <w:t xml:space="preserve">consistency and</w:t>
+      </w:r>
+      <w:r>
+        <w:t xml:space="preserve"> </w:t>
+      </w:r>
+      <m:oMath>
+        <m:r>
+          <m:t>r</m:t>
+        </m:r>
+        <m:r>
+          <m:rPr>
+            <m:sty m:val="p"/>
+          </m:rPr>
+          <m:t>=</m:t>
+        </m:r>
+        <m:r>
+          <m:t>0.903</m:t>
+        </m:r>
+      </m:oMath>
+      <w:r>
+        <w:t xml:space="preserve"> </w:t>
+      </w:r>
+      <w:r>
+        <w:t xml:space="preserve">for IoU across configurations), and</w:t>
+      </w:r>
+      <w:r>
+        <w:t xml:space="preserve"> </w:t>
+      </w:r>
+      <m:oMath>
+        <m:r>
+          <m:t>σ</m:t>
+        </m:r>
+      </m:oMath>
+      <w:r>
+        <w:t xml:space="preserve"> </w:t>
+      </w:r>
+      <w:r>
+        <w:t xml:space="preserve">added nothing once accuracy was known. The</w:t>
+      </w:r>
+      <w:r>
+        <w:t xml:space="preserve"> </w:t>
+      </w:r>
+      <w:r>
+        <w:t xml:space="preserve">small change under clipping alone (0.700 to 0.663) suggests that noise affects explanations mainly through the</w:t>
+      </w:r>
+      <w:r>
+        <w:t xml:space="preserve"> </w:t>
+      </w:r>
+      <w:r>
+        <w:t xml:space="preserve">accuracy it costs, although the correlational design cannot establish that pathway.</w:t>
+      </w:r>
+    </w:p>
+    <w:p>
+      <w:pPr>
+        <w:pStyle w:val="BodyText"/>
+        <w:spacing w:line="480" w:lineRule="auto"/>
+        <w:jc w:val="left"/>
+      </w:pPr>
+      <w:r>
+        <w:t xml:space="preserve">The low absolute localisation, with a pointing hit rate of 0.197 even without DP, is consistent with the</w:t>
+      </w:r>
+      <w:r>
+        <w:t xml:space="preserve"> </w:t>
+      </w:r>
+      <m:oMath>
+        <m:r>
+          <m:t>4</m:t>
+        </m:r>
+        <m:r>
+          <m:rPr>
+            <m:sty m:val="p"/>
+          </m:rPr>
+          <m:t>×</m:t>
+        </m:r>
+        <m:r>
+          <m:t>4</m:t>
+        </m:r>
+      </m:oMath>
+      <w:r>
+        <w:t xml:space="preserve"> </w:t>
+      </w:r>
+      <w:r>
+        <w:t xml:space="preserve">resolution of the last ResNet block at 128-pixel input. Clinically, DP cost most in meningioma and no-tumour</w:t>
+      </w:r>
+      <w:r>
+        <w:t xml:space="preserve"> </w:t>
+      </w:r>
+      <w:r>
+        <w:t xml:space="preserve">sensitivity while missed tumours stayed rare (Table 4), so a private model would mainly need review of</w:t>
+      </w:r>
+      <w:r>
+        <w:t xml:space="preserve"> </w:t>
+      </w:r>
+      <w:r>
+        <w:t xml:space="preserve">its tumour-type calls. IG with a black baseline failed the randomisation test, which argues against</w:t>
+      </w:r>
+      <w:r>
+        <w:t xml:space="preserve"> </w:t>
+      </w:r>
+      <w:r>
+        <w:t xml:space="preserve">reporting such maps without that check.</w:t>
+      </w:r>
+      <w:r>
+        <w:rPr>
+          <w:vertAlign w:val="superscript"/>
+        </w:rPr>
+        <w:t xml:space="preserve">29</w:t>
+      </w:r>
+    </w:p>
+    <w:bookmarkEnd w:id="67"/>
+    <w:bookmarkStart w:id="68" w:name="benchmark-leakage-and-source-confounding"/>
+    <w:p>
+      <w:pPr>
+        <w:pStyle w:val="Heading2"/>
+        <w:spacing w:line="480" w:lineRule="auto"/>
+        <w:jc w:val="left"/>
+      </w:pPr>
+      <w:r>
+        <w:t xml:space="preserve">Benchmark leakage and source confounding</w:t>
+      </w:r>
+    </w:p>
+    <w:p>
+      <w:pPr>
+        <w:pStyle w:val="FirstParagraph"/>
+        <w:spacing w:line="480" w:lineRule="auto"/>
+        <w:jc w:val="left"/>
+      </w:pPr>
+      <w:r>
+        <w:t xml:space="preserve">The correlation check found mirrored duplicates that perceptual hashing missed, concentrated in the Br35H no-tumour</w:t>
+      </w:r>
+      <w:r>
+        <w:t xml:space="preserve"> </w:t>
+      </w:r>
+      <w:r>
+        <w:t xml:space="preserve">class, and training with random flips can then show a model the exact test image. Source was also decodable from images</w:t>
+      </w:r>
+      <w:r>
+        <w:t xml:space="preserve"> </w:t>
+      </w:r>
+      <w:r>
+        <w:t xml:space="preserve">of one class even by a random network, so headline accuracy on merged collections partly measures which collection an</w:t>
+      </w:r>
+      <w:r>
+        <w:t xml:space="preserve"> </w:t>
+      </w:r>
+      <w:r>
+        <w:t xml:space="preserve">image came from, as Vangala et al. reported for centralised benchmarks.</w:t>
+      </w:r>
+      <w:r>
+        <w:rPr>
+          <w:vertAlign w:val="superscript"/>
+        </w:rPr>
+        <w:t xml:space="preserve">10</w:t>
+      </w:r>
+      <w:r>
+        <w:t xml:space="preserve"> </w:t>
+      </w:r>
+      <w:r>
+        <w:t xml:space="preserve">Accuracies reported on these</w:t>
+      </w:r>
+      <w:r>
+        <w:t xml:space="preserve"> </w:t>
+      </w:r>
+      <w:r>
+        <w:t xml:space="preserve">collections</w:t>
+      </w:r>
+      <w:r>
+        <w:rPr>
+          <w:vertAlign w:val="superscript"/>
+        </w:rPr>
+        <w:t xml:space="preserve">15-18</w:t>
       </w:r>
       <w:r>
         <w:t xml:space="preserve"> </w:t>
@@ -16568,7 +16610,7 @@
         <w:rPr>
           <w:vertAlign w:val="superscript"/>
         </w:rPr>
-        <w:t xml:space="preserve">28</w:t>
+        <w:t xml:space="preserve">30</w:t>
       </w:r>
       <w:r>
         <w:t xml:space="preserve"> </w:t>
@@ -16580,7 +16622,7 @@
         <w:rPr>
           <w:vertAlign w:val="superscript"/>
         </w:rPr>
-        <w:t xml:space="preserve">29</w:t>
+        <w:t xml:space="preserve">31</w:t>
       </w:r>
       <w:r>
         <w:t xml:space="preserve"> </w:t>
@@ -16592,7 +16634,7 @@
         <w:rPr>
           <w:vertAlign w:val="superscript"/>
         </w:rPr>
-        <w:t xml:space="preserve">30</w:t>
+        <w:t xml:space="preserve">32</w:t>
       </w:r>
       <w:r>
         <w:t xml:space="preserve"> </w:t>
@@ -16734,6 +16776,32 @@
         <w:jc w:val="left"/>
       </w:pPr>
       <w:r>
+        <w:t xml:space="preserve">Jung JH, Sunwoo L, Ji H, Yoo S, Park JE, Lee JG. Deep learning-based segmentation of small-volume brain metastases in lung cancer patients.</w:t>
+      </w:r>
+      <w:r>
+        <w:t xml:space="preserve"> </w:t>
+      </w:r>
+      <w:r>
+        <w:rPr>
+          <w:iCs/>
+          <w:i/>
+        </w:rPr>
+        <w:t xml:space="preserve">Intell Oncol</w:t>
+      </w:r>
+      <w:r>
+        <w:t xml:space="preserve">. 2026;2(2):100049. doi:10.1016/j.intonc.2026.100049</w:t>
+      </w:r>
+    </w:p>
+    <w:p>
+      <w:pPr>
+        <w:numPr>
+          <w:ilvl w:val="0"/>
+          <w:numId w:val="1005"/>
+        </w:numPr>
+        <w:spacing w:line="480" w:lineRule="auto"/>
+        <w:jc w:val="left"/>
+      </w:pPr>
+      <w:r>
         <w:t xml:space="preserve">Sheller MJ, Reina GA, Edwards B, Martin J, Bakas S. Multi-institutional deep learning modeling without sharing patient data: a feasibility study on brain tumor segmentation.</w:t>
       </w:r>
       <w:r>
@@ -16800,6 +16868,32 @@
       </w:r>
       <w:r>
         <w:t xml:space="preserve">. 2022;13(1):7346. doi:10.1038/s41467-022-33407-5</w:t>
+      </w:r>
+    </w:p>
+    <w:p>
+      <w:pPr>
+        <w:numPr>
+          <w:ilvl w:val="0"/>
+          <w:numId w:val="1005"/>
+        </w:numPr>
+        <w:spacing w:line="480" w:lineRule="auto"/>
+        <w:jc w:val="left"/>
+      </w:pPr>
+      <w:r>
+        <w:t xml:space="preserve">Cai W. DeepSeek AI: transforming medical AI with cost-efficiency, transparency, and privacy preservation.</w:t>
+      </w:r>
+      <w:r>
+        <w:t xml:space="preserve"> </w:t>
+      </w:r>
+      <w:r>
+        <w:rPr>
+          <w:iCs/>
+          <w:i/>
+        </w:rPr>
+        <w:t xml:space="preserve">Intell Oncol</w:t>
+      </w:r>
+      <w:r>
+        <w:t xml:space="preserve">. 2025;1(2):172-175. doi:10.1016/j.intonc.2025.03.006</w:t>
       </w:r>
     </w:p>
     <w:p>
@@ -17449,6 +17543,32 @@
           <w:t xml:space="preserve">https://www.kaggle.com/datasets/ahmedhamada0/brain-tumor-detection</w:t>
         </w:r>
       </w:hyperlink>
+    </w:p>
+    <w:p>
+      <w:pPr>
+        <w:numPr>
+          <w:ilvl w:val="0"/>
+          <w:numId w:val="1005"/>
+        </w:numPr>
+        <w:spacing w:line="480" w:lineRule="auto"/>
+        <w:jc w:val="left"/>
+      </w:pPr>
+      <w:r>
+        <w:t xml:space="preserve">Li D, Wei J, Lü Q, Le J, Liao X. Privacy-preserving medical image processing based on cryptography primitives: a review of methods.</w:t>
+      </w:r>
+      <w:r>
+        <w:t xml:space="preserve"> </w:t>
+      </w:r>
+      <w:r>
+        <w:rPr>
+          <w:iCs/>
+          <w:i/>
+        </w:rPr>
+        <w:t xml:space="preserve">Intell Oncol</w:t>
+      </w:r>
+      <w:r>
+        <w:t xml:space="preserve">. 2026;2(4):100083. doi:10.1016/j.intonc.2026.100083</w:t>
+      </w:r>
     </w:p>
     <w:p>
       <w:pPr>

</xml_diff>

<commit_message>
Full-text check of Lakshmi and Qazi; specific wording on unreported budgets (D64)
Co-Authored-By: Claude Opus 5.5 <noreply@anthropic.com>
Claude-Session: https://claude.ai/code/session_01GmqQpV3GfnfDawN9ZdytqY
</commit_message>
<xml_diff>
--- a/paper/submission/manuscript.docx
+++ b/paper/submission/manuscript.docx
@@ -675,31 +675,122 @@
         <w:t xml:space="preserve"> </w:t>
       </w:r>
       <w:r>
-        <w:t xml:space="preserve">The privacy mechanism, its budget and the protected unit are also often not reported in a</w:t>
-      </w:r>
-      <w:r>
-        <w:t xml:space="preserve"> </w:t>
-      </w:r>
-      <w:r>
-        <w:t xml:space="preserve">form that can be checked.</w:t>
+        <w:t xml:space="preserve">The privacy budget and the protected unit are also often not reported in a</w:t>
+      </w:r>
+      <w:r>
+        <w:t xml:space="preserve"> </w:t>
+      </w:r>
+      <w:r>
+        <w:t xml:space="preserve">form that can be checked. One recent federated brain tumour study leaves the values of</w:t>
+      </w:r>
+      <w:r>
+        <w:t xml:space="preserve"> </w:t>
+      </w:r>
+      <m:oMath>
+        <m:r>
+          <m:t>ε</m:t>
+        </m:r>
+      </m:oMath>
+      <w:r>
+        <w:t xml:space="preserve"> </w:t>
+      </w:r>
+      <w:r>
+        <w:t xml:space="preserve">and</w:t>
+      </w:r>
+      <w:r>
+        <w:t xml:space="preserve"> </w:t>
+      </w:r>
+      <m:oMath>
+        <m:r>
+          <m:t>δ</m:t>
+        </m:r>
+      </m:oMath>
+      <w:r>
+        <w:t xml:space="preserve"> </w:t>
+      </w:r>
+      <w:r>
+        <w:t xml:space="preserve">blank in its published text,</w:t>
       </w:r>
       <w:r>
         <w:rPr>
           <w:vertAlign w:val="superscript"/>
         </w:rPr>
-        <w:t xml:space="preserve">11-13</w:t>
-      </w:r>
-      <w:r>
-        <w:t xml:space="preserve"> </w:t>
-      </w:r>
-      <w:r>
-        <w:t xml:space="preserve">[CHECK: the statement for lakshmi2026 and</w:t>
-      </w:r>
-      <w:r>
-        <w:t xml:space="preserve"> </w:t>
-      </w:r>
-      <w:r>
-        <w:t xml:space="preserve">qazi2026 rests on their abstracts, confirm against the full texts]</w:t>
+        <w:t xml:space="preserve">11</w:t>
+      </w:r>
+      <w:r>
+        <w:t xml:space="preserve"> </w:t>
+      </w:r>
+      <w:r>
+        <w:t xml:space="preserve">and a multi-disease study that includes brain tumour MRI reports the</w:t>
+      </w:r>
+      <w:r>
+        <w:t xml:space="preserve"> </w:t>
+      </w:r>
+      <w:r>
+        <w:t xml:space="preserve">noise multiplier and clipping norm of DP-SGD without</w:t>
+      </w:r>
+      <w:r>
+        <w:t xml:space="preserve"> </w:t>
+      </w:r>
+      <m:oMath>
+        <m:r>
+          <m:t>ε</m:t>
+        </m:r>
+      </m:oMath>
+      <w:r>
+        <w:t xml:space="preserve">,</w:t>
+      </w:r>
+      <w:r>
+        <w:t xml:space="preserve"> </w:t>
+      </w:r>
+      <m:oMath>
+        <m:r>
+          <m:t>δ</m:t>
+        </m:r>
+      </m:oMath>
+      <w:r>
+        <w:t xml:space="preserve"> </w:t>
+      </w:r>
+      <w:r>
+        <w:t xml:space="preserve">or the sampling rate.</w:t>
+      </w:r>
+      <w:r>
+        <w:rPr>
+          <w:vertAlign w:val="superscript"/>
+        </w:rPr>
+        <w:t xml:space="preserve">12</w:t>
+      </w:r>
+      <w:r>
+        <w:t xml:space="preserve"> </w:t>
+      </w:r>
+      <w:r>
+        <w:t xml:space="preserve">A</w:t>
+      </w:r>
+      <w:r>
+        <w:t xml:space="preserve"> </w:t>
+      </w:r>
+      <w:r>
+        <w:t xml:space="preserve">third study states an</w:t>
+      </w:r>
+      <w:r>
+        <w:t xml:space="preserve"> </w:t>
+      </w:r>
+      <m:oMath>
+        <m:r>
+          <m:t>ε</m:t>
+        </m:r>
+      </m:oMath>
+      <w:r>
+        <w:t xml:space="preserve"> </w:t>
+      </w:r>
+      <w:r>
+        <w:t xml:space="preserve">that its unclipped mechanism cannot support.</w:t>
+      </w:r>
+      <w:r>
+        <w:rPr>
+          <w:vertAlign w:val="superscript"/>
+        </w:rPr>
+        <w:t xml:space="preserve">13</w:t>
       </w:r>
     </w:p>
     <w:p>

</xml_diff>

<commit_message>
Flat Editorial Manager upload set: title page, ethical statement, editable tables, flat LaTeX zip (D65)
Co-Authored-By: Claude Opus 5.5 <noreply@anthropic.com>
Claude-Session: https://claude.ai/code/session_01GmqQpV3GfnfDawN9ZdytqY
</commit_message>
<xml_diff>
--- a/paper/submission/manuscript.docx
+++ b/paper/submission/manuscript.docx
@@ -144,7 +144,7 @@
         <w:t xml:space="preserve"> </w:t>
       </w:r>
       <w:r>
-        <w:t xml:space="preserve">110067, India. Telephone [CHECK: number with country and area code]. E-mail addresses shashi17_scs@jnu.ac.in, poonguzhali@jnu.ac.in.</w:t>
+        <w:t xml:space="preserve">110067, India. E-mail addresses shashi17_scs@jnu.ac.in, poonguzhali@jnu.ac.in.</w:t>
       </w:r>
     </w:p>
     <w:bookmarkStart w:id="20" w:name="abstract"/>
@@ -16848,7 +16848,7 @@
         <w:t xml:space="preserve"> </w:t>
       </w:r>
       <w:r>
-        <w:t xml:space="preserve">responsibility for the content of the published article. [CHECK: the authors must confirm the extent of use]</w:t>
+        <w:t xml:space="preserve">responsibility for the content of the published article.</w:t>
       </w:r>
     </w:p>
     <w:bookmarkEnd w:id="80"/>

</xml_diff>

<commit_message>
Related work describes prior work only; contributions are methodological (D66)
Co-Authored-By: Claude Opus 5.5 <noreply@anthropic.com>
Claude-Session: https://claude.ai/code/session_01GmqQpV3GfnfDawN9ZdytqY
</commit_message>
<xml_diff>
--- a/paper/submission/manuscript.docx
+++ b/paper/submission/manuscript.docx
@@ -881,7 +881,13 @@
         <w:t xml:space="preserve"> </w:t>
       </w:r>
       <w:r>
-        <w:t xml:space="preserve">FedProx, SCAFFOLD or transfer learning, and some add Grad-CAM pictures.</w:t>
+        <w:t xml:space="preserve">FedProx, SCAFFOLD or transfer learning, and some add Grad-CAM</w:t>
+      </w:r>
+      <w:r>
+        <w:t xml:space="preserve"> </w:t>
+      </w:r>
+      <w:r>
+        <w:t xml:space="preserve">pictures.</w:t>
       </w:r>
       <w:r>
         <w:rPr>
@@ -893,13 +899,13 @@
         <w:t xml:space="preserve"> </w:t>
       </w:r>
       <w:r>
-        <w:t xml:space="preserve">The present work differs by training on a deduplicated, patient-disjoint benchmark and by attaching an accounted</w:t>
-      </w:r>
-      <w:r>
-        <w:t xml:space="preserve"> </w:t>
-      </w:r>
-      <w:r>
-        <w:t xml:space="preserve">privacy guarantee to every private model.</w:t>
+        <w:t xml:space="preserve">None of these studies states a formal privacy guarantee,</w:t>
+      </w:r>
+      <w:r>
+        <w:t xml:space="preserve"> </w:t>
+      </w:r>
+      <w:r>
+        <w:t xml:space="preserve">and none reports a check for duplicates across its training and test splits.</w:t>
       </w:r>
     </w:p>
     <w:p>
@@ -1028,13 +1034,13 @@
         <w:t xml:space="preserve"> </w:t>
       </w:r>
       <w:r>
-        <w:t xml:space="preserve">These studies protect single records, whereas the present work compares record-level and</w:t>
-      </w:r>
-      <w:r>
-        <w:t xml:space="preserve"> </w:t>
-      </w:r>
-      <w:r>
-        <w:t xml:space="preserve">patient-level guarantees on the same data and audits both empirically.</w:t>
+        <w:t xml:space="preserve">These studies apply DP-SGD per image, so they do not measure the cost of protecting a whole</w:t>
+      </w:r>
+      <w:r>
+        <w:t xml:space="preserve"> </w:t>
+      </w:r>
+      <w:r>
+        <w:t xml:space="preserve">patient, who in slice-based MRI contributes many images.</w:t>
       </w:r>
     </w:p>
     <w:p>
@@ -1062,13 +1068,13 @@
         <w:t xml:space="preserve"> </w:t>
       </w:r>
       <w:r>
-        <w:t xml:space="preserve">Knolle et al. reported that patients with several similar records can face</w:t>
-      </w:r>
-      <w:r>
-        <w:t xml:space="preserve"> </w:t>
-      </w:r>
-      <w:r>
-        <w:t xml:space="preserve">near-perfect attack success even when aggregate success looks random.</w:t>
+        <w:t xml:space="preserve">Knolle et al. reported that patients with several similar records can face near-perfect attack success even when aggregate success</w:t>
+      </w:r>
+      <w:r>
+        <w:t xml:space="preserve"> </w:t>
+      </w:r>
+      <w:r>
+        <w:t xml:space="preserve">looks random.</w:t>
       </w:r>
       <w:r>
         <w:rPr>
@@ -1080,13 +1086,13 @@
         <w:t xml:space="preserve"> </w:t>
       </w:r>
       <w:r>
-        <w:t xml:space="preserve">The closest federated brain</w:t>
-      </w:r>
-      <w:r>
-        <w:t xml:space="preserve"> </w:t>
-      </w:r>
-      <w:r>
-        <w:t xml:space="preserve">tumour study adds Gaussian noise with standard deviation 0.5 to client weights without clipping, so its stated</w:t>
+        <w:t xml:space="preserve">The closest federated brain tumour study adds Gaussian noise with standard deviation</w:t>
+      </w:r>
+      <w:r>
+        <w:t xml:space="preserve"> </w:t>
+      </w:r>
+      <w:r>
+        <w:t xml:space="preserve">0.5 to client weights without clipping, so its stated</w:t>
       </w:r>
       <w:r>
         <w:t xml:space="preserve"> </w:t>
@@ -1100,7 +1106,13 @@
         <w:t xml:space="preserve"> </w:t>
       </w:r>
       <w:r>
-        <w:t xml:space="preserve">of about 3.4 cannot be derived from the mechanism.</w:t>
+        <w:t xml:space="preserve">of about 3.4 cannot be derived from the</w:t>
+      </w:r>
+      <w:r>
+        <w:t xml:space="preserve"> </w:t>
+      </w:r>
+      <w:r>
+        <w:t xml:space="preserve">mechanism.</w:t>
       </w:r>
       <w:r>
         <w:rPr>
@@ -1112,13 +1124,19 @@
         <w:t xml:space="preserve"> </w:t>
       </w:r>
       <w:r>
-        <w:t xml:space="preserve">The present work runs LiRA at the</w:t>
-      </w:r>
-      <w:r>
-        <w:t xml:space="preserve"> </w:t>
-      </w:r>
-      <w:r>
-        <w:t xml:space="preserve">image and the patient level against formally private models and against that unclipped mechanism.</w:t>
+        <w:t xml:space="preserve">A mechanism without a valid accounting can be assessed only by an empirical attack, and</w:t>
+      </w:r>
+      <w:r>
+        <w:t xml:space="preserve"> </w:t>
+      </w:r>
+      <w:r>
+        <w:t xml:space="preserve">the patient-level risk shown by Knolle et al. is likely to be large in slice-based MRI, where one patient contributes</w:t>
+      </w:r>
+      <w:r>
+        <w:t xml:space="preserve"> </w:t>
+      </w:r>
+      <w:r>
+        <w:t xml:space="preserve">many images.</w:t>
       </w:r>
     </w:p>
     <w:p>
@@ -1128,7 +1146,7 @@
         <w:jc w:val="left"/>
       </w:pPr>
       <w:r>
-        <w:t xml:space="preserve">Private training also changes explanations, since Saifullah et al. and Manna and Sett reported that DP alters</w:t>
+        <w:t xml:space="preserve">Private training also changes explanations, as Saifullah et al. and Manna and Sett reported that DP alters</w:t>
       </w:r>
       <w:r>
         <w:t xml:space="preserve"> </w:t>
@@ -1164,19 +1182,13 @@
         <w:t xml:space="preserve"> </w:t>
       </w:r>
       <w:r>
-        <w:t xml:space="preserve">The present work measures Grad-CAM localisation against expert tumour</w:t>
-      </w:r>
-      <w:r>
-        <w:t xml:space="preserve"> </w:t>
-      </w:r>
-      <w:r>
-        <w:t xml:space="preserve">masks, its consistency across seeds and a randomisation check, and asks whether privacy affects explanations beyond</w:t>
-      </w:r>
-      <w:r>
-        <w:t xml:space="preserve"> </w:t>
-      </w:r>
-      <w:r>
-        <w:t xml:space="preserve">its effect on accuracy.</w:t>
+        <w:t xml:space="preserve">Neither DP study evaluated brain MRI, so the effect of privacy on how well</w:t>
+      </w:r>
+      <w:r>
+        <w:t xml:space="preserve"> </w:t>
+      </w:r>
+      <w:r>
+        <w:t xml:space="preserve">explanations localise brain tumours against expert masks remains unmeasured.</w:t>
       </w:r>
     </w:p>
     <w:p>
@@ -1186,13 +1198,13 @@
         <w:jc w:val="left"/>
       </w:pPr>
       <w:r>
-        <w:t xml:space="preserve">Benchmark contamination is the last theme, and Vangala et al. found that 28.8% of a widely used Kaggle test split</w:t>
-      </w:r>
-      <w:r>
-        <w:t xml:space="preserve"> </w:t>
-      </w:r>
-      <w:r>
-        <w:t xml:space="preserve">has a near-twin in training,</w:t>
+        <w:t xml:space="preserve">For benchmark contamination, Vangala et al. found with cross-correlation and file hashes that 28.8% of a</w:t>
+      </w:r>
+      <w:r>
+        <w:t xml:space="preserve"> </w:t>
+      </w:r>
+      <w:r>
+        <w:t xml:space="preserve">widely used Kaggle test split has a near-twin in training,</w:t>
       </w:r>
       <w:r>
         <w:rPr>
@@ -1204,13 +1216,13 @@
         <w:t xml:space="preserve"> </w:t>
       </w:r>
       <w:r>
-        <w:t xml:space="preserve">and the source collections differ in class</w:t>
-      </w:r>
-      <w:r>
-        <w:t xml:space="preserve"> </w:t>
-      </w:r>
-      <w:r>
-        <w:t xml:space="preserve">composition.</w:t>
+        <w:t xml:space="preserve">and the source collections differ in</w:t>
+      </w:r>
+      <w:r>
+        <w:t xml:space="preserve"> </w:t>
+      </w:r>
+      <w:r>
+        <w:t xml:space="preserve">class composition.</w:t>
       </w:r>
       <w:r>
         <w:rPr>
@@ -1222,37 +1234,35 @@
         <w:t xml:space="preserve"> </w:t>
       </w:r>
       <w:r>
-        <w:t xml:space="preserve">The present work adds a mirror-aware correlation check, because</w:t>
-      </w:r>
-      <w:r>
-        <w:t xml:space="preserve"> </w:t>
-      </w:r>
-      <w:r>
-        <w:t xml:space="preserve">perceptual hashes do not match copies flipped left to right. Taken together, the accuracy cost and the empirical</w:t>
-      </w:r>
-      <w:r>
-        <w:t xml:space="preserve"> </w:t>
-      </w:r>
-      <w:r>
-        <w:t xml:space="preserve">leakage of record-level and patient-level DP for federated brain tumour MRI on contamination-checked data, together</w:t>
-      </w:r>
-      <w:r>
-        <w:t xml:space="preserve"> </w:t>
-      </w:r>
-      <w:r>
-        <w:t xml:space="preserve">with their effect on explanation fidelity, have not been measured side by side. The individual methods used here are</w:t>
-      </w:r>
-      <w:r>
-        <w:t xml:space="preserve"> </w:t>
-      </w:r>
-      <w:r>
-        <w:t xml:space="preserve">established, so the contribution of the present work lies in applying them jointly, with accounted guarantees at two</w:t>
-      </w:r>
-      <w:r>
-        <w:t xml:space="preserve"> </w:t>
-      </w:r>
-      <w:r>
-        <w:t xml:space="preserve">privacy units and an attack whose members and non-members are matched in composition.</w:t>
+        <w:t xml:space="preserve">Duplicate checks that compare images only in their stored</w:t>
+      </w:r>
+      <w:r>
+        <w:t xml:space="preserve"> </w:t>
+      </w:r>
+      <w:r>
+        <w:t xml:space="preserve">orientation, including perceptual hashing, do not match a copy flipped left to right.</w:t>
+      </w:r>
+    </w:p>
+    <w:p>
+      <w:pPr>
+        <w:pStyle w:val="BodyText"/>
+        <w:spacing w:line="480" w:lineRule="auto"/>
+        <w:jc w:val="left"/>
+      </w:pPr>
+      <w:r>
+        <w:t xml:space="preserve">Taken together, the accuracy cost and the empirical leakage of record-level and patient-level DP for federated brain</w:t>
+      </w:r>
+      <w:r>
+        <w:t xml:space="preserve"> </w:t>
+      </w:r>
+      <w:r>
+        <w:t xml:space="preserve">tumour MRI on contamination-checked data, together with their effect on explanation fidelity, have not been measured</w:t>
+      </w:r>
+      <w:r>
+        <w:t xml:space="preserve"> </w:t>
+      </w:r>
+      <w:r>
+        <w:t xml:space="preserve">side by side.</w:t>
       </w:r>
     </w:p>
     <w:bookmarkEnd w:id="22"/>
@@ -1274,7 +1284,13 @@
         <w:jc w:val="left"/>
       </w:pPr>
       <w:r>
-        <w:t xml:space="preserve">The study makes five contributions, each answered by the measurements summarised in the abstract.</w:t>
+        <w:t xml:space="preserve">The study combines established methods, and its five contributions lie in how these are adapted, combined and</w:t>
+      </w:r>
+      <w:r>
+        <w:t xml:space="preserve"> </w:t>
+      </w:r>
+      <w:r>
+        <w:t xml:space="preserve">controlled for federated brain tumour MRI.</w:t>
       </w:r>
     </w:p>
     <w:p>
@@ -1291,25 +1307,25 @@
           <w:bCs/>
           <w:b/>
         </w:rPr>
-        <w:t xml:space="preserve">A deduplicated, patient-disjoint benchmark.</w:t>
-      </w:r>
-      <w:r>
-        <w:t xml:space="preserve"> </w:t>
-      </w:r>
-      <w:r>
-        <w:t xml:space="preserve">Perceptual-hash deduplication reduced 7828 labelled</w:t>
-      </w:r>
-      <w:r>
-        <w:t xml:space="preserve"> </w:t>
-      </w:r>
-      <w:r>
-        <w:t xml:space="preserve">images to 3845 images split by patient, and a mirror-aware correlation check found 66 contaminated test images,</w:t>
-      </w:r>
-      <w:r>
-        <w:t xml:space="preserve"> </w:t>
-      </w:r>
-      <w:r>
-        <w:t xml:space="preserve">which are excluded from every reported result.</w:t>
+        <w:t xml:space="preserve">A contamination-checked benchmark.</w:t>
+      </w:r>
+      <w:r>
+        <w:t xml:space="preserve"> </w:t>
+      </w:r>
+      <w:r>
+        <w:t xml:space="preserve">Three public collections are merged by perceptual-hash</w:t>
+      </w:r>
+      <w:r>
+        <w:t xml:space="preserve"> </w:t>
+      </w:r>
+      <w:r>
+        <w:t xml:space="preserve">deduplication, split by patient or by groups of near-identical images, and screened by a normalised cross-correlation</w:t>
+      </w:r>
+      <w:r>
+        <w:t xml:space="preserve"> </w:t>
+      </w:r>
+      <w:r>
+        <w:t xml:space="preserve">check in both orientations that defines the clean test set used for every evaluation in the main text.</w:t>
       </w:r>
     </w:p>
     <w:p>
@@ -1326,77 +1342,25 @@
           <w:bCs/>
           <w:b/>
         </w:rPr>
-        <w:t xml:space="preserve">An accounted privacy and utility comparison at two privacy units.</w:t>
-      </w:r>
-      <w:r>
-        <w:t xml:space="preserve"> </w:t>
-      </w:r>
-      <w:r>
-        <w:t xml:space="preserve">Central and federated models were</w:t>
-      </w:r>
-      <w:r>
-        <w:t xml:space="preserve"> </w:t>
-      </w:r>
-      <w:r>
-        <w:t xml:space="preserve">trained under record-level and patient-level DP-SGD with Rényi accounting and five seeds per setting.</w:t>
-      </w:r>
-      <w:r>
-        <w:t xml:space="preserve"> </w:t>
-      </w:r>
-      <w:r>
-        <w:t xml:space="preserve">Record-level</w:t>
-      </w:r>
-      <w:r>
-        <w:t xml:space="preserve"> </w:t>
-      </w:r>
-      <m:oMath>
-        <m:r>
-          <m:t>ε</m:t>
-        </m:r>
-        <m:r>
-          <m:rPr>
-            <m:sty m:val="p"/>
-          </m:rPr>
-          <m:t>=</m:t>
-        </m:r>
-        <m:r>
-          <m:t>8</m:t>
-        </m:r>
-      </m:oMath>
-      <w:r>
-        <w:t xml:space="preserve"> </w:t>
-      </w:r>
-      <w:r>
-        <w:t xml:space="preserve">cost 0.130 in central balanced accuracy, mostly through meningioma and no-tumour</w:t>
-      </w:r>
-      <w:r>
-        <w:t xml:space="preserve"> </w:t>
-      </w:r>
-      <w:r>
-        <w:t xml:space="preserve">sensitivity, whereas patient-level DP needed</w:t>
-      </w:r>
-      <w:r>
-        <w:t xml:space="preserve"> </w:t>
-      </w:r>
-      <m:oMath>
-        <m:r>
-          <m:t>ε</m:t>
-        </m:r>
-        <m:r>
-          <m:rPr>
-            <m:sty m:val="p"/>
-          </m:rPr>
-          <m:t>=</m:t>
-        </m:r>
-        <m:r>
-          <m:t>64</m:t>
-        </m:r>
-      </m:oMath>
-      <w:r>
-        <w:t xml:space="preserve"> </w:t>
-      </w:r>
-      <w:r>
-        <w:t xml:space="preserve">to exceed that accuracy.</w:t>
+        <w:t xml:space="preserve">Patient-level DP-SGD for federated training.</w:t>
+      </w:r>
+      <w:r>
+        <w:t xml:space="preserve"> </w:t>
+      </w:r>
+      <w:r>
+        <w:t xml:space="preserve">Each client samples patients instead of images and clips</w:t>
+      </w:r>
+      <w:r>
+        <w:t xml:space="preserve"> </w:t>
+      </w:r>
+      <w:r>
+        <w:t xml:space="preserve">each patient’s mean gradient. Rényi accounting, composition over the clients that hold one patient and size-weighted</w:t>
+      </w:r>
+      <w:r>
+        <w:t xml:space="preserve"> </w:t>
+      </w:r>
+      <w:r>
+        <w:t xml:space="preserve">aggregation then allow record-level and patient-level guarantees to be compared at the same budget.</w:t>
       </w:r>
     </w:p>
     <w:p>
@@ -1413,65 +1377,25 @@
           <w:bCs/>
           <w:b/>
         </w:rPr>
-        <w:t xml:space="preserve">The effect of client count under DP.</w:t>
-      </w:r>
-      <w:r>
-        <w:t xml:space="preserve"> </w:t>
-      </w:r>
-      <w:r>
-        <w:t xml:space="preserve">Splitting the same images across more clients lowered accuracy</w:t>
-      </w:r>
-      <w:r>
-        <w:t xml:space="preserve"> </w:t>
-      </w:r>
-      <w:r>
-        <w:t xml:space="preserve">under DP by 0.096 per unit of</w:t>
-      </w:r>
-      <w:r>
-        <w:t xml:space="preserve"> </w:t>
-      </w:r>
-      <m:oMath>
-        <m:r>
-          <m:rPr>
-            <m:sty m:val="p"/>
-          </m:rPr>
-          <m:t>ln</m:t>
-        </m:r>
-        <m:r>
-          <m:t>K</m:t>
-        </m:r>
-      </m:oMath>
-      <w:r>
-        <w:t xml:space="preserve"> </w:t>
-      </w:r>
-      <w:r>
-        <w:t xml:space="preserve">at</w:t>
-      </w:r>
-      <w:r>
-        <w:t xml:space="preserve"> </w:t>
-      </w:r>
-      <m:oMath>
-        <m:r>
-          <m:t>ε</m:t>
-        </m:r>
-        <m:r>
-          <m:rPr>
-            <m:sty m:val="p"/>
-          </m:rPr>
-          <m:t>=</m:t>
-        </m:r>
-        <m:r>
-          <m:t>3</m:t>
-        </m:r>
-      </m:oMath>
-      <w:r>
-        <w:t xml:space="preserve">, consistent with the aggregated noise scale, and FedProx</w:t>
-      </w:r>
-      <w:r>
-        <w:t xml:space="preserve"> </w:t>
-      </w:r>
-      <w:r>
-        <w:t xml:space="preserve">and SCAFFOLD did not recover the loss.</w:t>
+        <w:t xml:space="preserve">An analysis of client count under DP.</w:t>
+      </w:r>
+      <w:r>
+        <w:t xml:space="preserve"> </w:t>
+      </w:r>
+      <w:r>
+        <w:t xml:space="preserve">The aggregated noise scale of client-side DP-SGD is derived as a</w:t>
+      </w:r>
+      <w:r>
+        <w:t xml:space="preserve"> </w:t>
+      </w:r>
+      <w:r>
+        <w:t xml:space="preserve">function of the number of clients and tested by splitting fixed data across three to 15 clients. FedProx and a</w:t>
+      </w:r>
+      <w:r>
+        <w:t xml:space="preserve"> </w:t>
+      </w:r>
+      <w:r>
+        <w:t xml:space="preserve">SCAFFOLD variant with size-weighted control variates and a momentum-aware normaliser serve as drift corrections.</w:t>
       </w:r>
     </w:p>
     <w:p>
@@ -1488,31 +1412,25 @@
           <w:bCs/>
           <w:b/>
         </w:rPr>
-        <w:t xml:space="preserve">An empirical privacy audit.</w:t>
-      </w:r>
-      <w:r>
-        <w:t xml:space="preserve"> </w:t>
-      </w:r>
-      <w:r>
-        <w:t xml:space="preserve">LiRA with 16 shadow models per setting identified training images and</w:t>
-      </w:r>
-      <w:r>
-        <w:t xml:space="preserve"> </w:t>
-      </w:r>
-      <w:r>
-        <w:t xml:space="preserve">patients in non-private federated models, found no rate significantly above chance at 1% FPR under record-level DP</w:t>
-      </w:r>
-      <w:r>
-        <w:t xml:space="preserve"> </w:t>
-      </w:r>
-      <w:r>
-        <w:t xml:space="preserve">once non-members were matched to members by source and class, and still detected patients under an unclipped</w:t>
-      </w:r>
-      <w:r>
-        <w:t xml:space="preserve"> </w:t>
-      </w:r>
-      <w:r>
-        <w:t xml:space="preserve">weight-noise mechanism of higher utility.</w:t>
+        <w:t xml:space="preserve">A composition-matched membership audit.</w:t>
+      </w:r>
+      <w:r>
+        <w:t xml:space="preserve"> </w:t>
+      </w:r>
+      <w:r>
+        <w:t xml:space="preserve">Online LiRA with 16 shadow models per setting is run at the</w:t>
+      </w:r>
+      <w:r>
+        <w:t xml:space="preserve"> </w:t>
+      </w:r>
+      <w:r>
+        <w:t xml:space="preserve">image and the patient level, with non-members reweighted to the members’ source and class mix. Diverged models give an</w:t>
+      </w:r>
+      <w:r>
+        <w:t xml:space="preserve"> </w:t>
+      </w:r>
+      <w:r>
+        <w:t xml:space="preserve">empirical reference, and the unclipped weight-noise mechanism of prior work is reproduced for comparison.</w:t>
       </w:r>
     </w:p>
     <w:p>
@@ -1529,56 +1447,31 @@
           <w:bCs/>
           <w:b/>
         </w:rPr>
-        <w:t xml:space="preserve">Explanation fidelity under privacy.</w:t>
-      </w:r>
-      <w:r>
-        <w:t xml:space="preserve"> </w:t>
-      </w:r>
-      <w:r>
-        <w:t xml:space="preserve">Grad-CAM localisation and cross-seed consistency declined as</w:t>
-      </w:r>
-      <w:r>
-        <w:t xml:space="preserve"> </w:t>
-      </w:r>
-      <m:oMath>
-        <m:r>
-          <m:t>ε</m:t>
-        </m:r>
-      </m:oMath>
-      <w:r>
-        <w:t xml:space="preserve"> </w:t>
-      </w:r>
-      <w:r>
-        <w:t xml:space="preserve">decreased, consistency correlated with accuracy at</w:t>
-      </w:r>
-      <w:r>
-        <w:t xml:space="preserve"> </w:t>
-      </w:r>
-      <m:oMath>
-        <m:r>
-          <m:t>r</m:t>
-        </m:r>
-        <m:r>
-          <m:rPr>
-            <m:sty m:val="p"/>
-          </m:rPr>
-          <m:t>=</m:t>
-        </m:r>
-        <m:r>
-          <m:t>0.838</m:t>
-        </m:r>
-      </m:oMath>
-      <w:r>
-        <w:t xml:space="preserve"> </w:t>
-      </w:r>
-      <w:r>
-        <w:t xml:space="preserve">across 31 configurations, and the noise</w:t>
-      </w:r>
-      <w:r>
-        <w:t xml:space="preserve"> </w:t>
-      </w:r>
-      <w:r>
-        <w:t xml:space="preserve">multiplier added no explanatory power once accuracy was known.</w:t>
+        <w:t xml:space="preserve">An explanation-fidelity protocol under privacy.</w:t>
+      </w:r>
+      <w:r>
+        <w:t xml:space="preserve"> </w:t>
+      </w:r>
+      <w:r>
+        <w:t xml:space="preserve">Grad-CAM, Grad-CAM++ and Integrated Gradients are</w:t>
+      </w:r>
+      <w:r>
+        <w:t xml:space="preserve"> </w:t>
+      </w:r>
+      <w:r>
+        <w:t xml:space="preserve">scored against expert tumour masks and checked by a randomisation test and a skull-border analysis. Cross-seed</w:t>
+      </w:r>
+      <w:r>
+        <w:t xml:space="preserve"> </w:t>
+      </w:r>
+      <w:r>
+        <w:t xml:space="preserve">consistency and a configuration-level regression test whether noise affects explanations beyond its effect on</w:t>
+      </w:r>
+      <w:r>
+        <w:t xml:space="preserve"> </w:t>
+      </w:r>
+      <w:r>
+        <w:t xml:space="preserve">accuracy.</w:t>
       </w:r>
     </w:p>
     <w:p>

</xml_diff>